<commit_message>
Actualizar el documento del Sprint 2 con las observaciones de la revision
</commit_message>
<xml_diff>
--- a/Documentos/AEUVG - Desarrollo Sprint 2.docx
+++ b/Documentos/AEUVG - Desarrollo Sprint 2.docx
@@ -925,7 +925,7 @@
           <w:sz w:val="24"/>
           <w:szCs w:val="24"/>
         </w:rPr>
-        <w:t xml:space="preserve">Se exige al menos un organizador, ya sea una asociación, un club o una unidad de UVG, porque sin él el estudiante no sabe a quién corresponde la actividad, que es justamente lo que AEUVG pidió dejar claro en cada evento. El primero que se indica queda como organizador principal y es el que encabeza la tarjeta. Cada organizador guarda una sola referencia, como exige la restricción de la tabla, y al editar un evento se reemplazan en bloque dentro de la misma transacción, de modo que no quede un estado intermedio sin organizador.</w:t>
+        <w:t xml:space="preserve">Los organizadores son opcionales. Inicialmente se exigía al menos uno, pero durante la revisión del sprint AEUVG señaló que publica actividades propias que no corresponden a ninguna asociación ni club, y la regla obligaba a inventar un organizador solo para poder guardar el evento. Cuando sí se indican, el primero queda como organizador principal y es el que encabeza la tarjeta. Cada organizador guarda una sola referencia, como exige la restricción de la tabla, y al editar un evento se reemplazan en bloque dentro de la misma transacción.</w:t>
       </w:r>
     </w:p>
     <w:p>
@@ -2047,6 +2047,20 @@
           <w:szCs w:val="24"/>
         </w:rPr>
         <w:t xml:space="preserve">Queda pendiente de AEUVG la carga de sus eventos reales y la definición del servicio de imágenes que contratará; ninguna de las dos bloquea el sprint, ya que el módulo funciona con la información de prueba y sin proveedor de imágenes. Continúa también en gestión el trámite del dominio institucional iniciado en el Sprint 1.</w:t>
+      </w:r>
+    </w:p>
+    <w:p>
+      <w:pPr>
+        <w:spacing w:after="160" w:line="300"/>
+        <w:jc w:val="both"/>
+      </w:pPr>
+      <w:r>
+        <w:rPr>
+          <w:rFonts w:ascii="Times New Roman" w:cs="Times New Roman" w:eastAsia="Times New Roman" w:hAnsi="Times New Roman"/>
+          <w:sz w:val="24"/>
+          <w:szCs w:val="24"/>
+        </w:rPr>
+        <w:t xml:space="preserve">Tras la revisión del sprint se incorporaron las observaciones recibidas, sin alcance nuevo: los organizadores del evento pasaron a ser opcionales; el formulario del panel resume arriba los campos que impiden guardar y lleva la vista al primero de ellos, ya que en un formulario largo un error en un campo superior daba la impresión de que el botón no respondía; los servicios de administración responden ahora con un mensaje explicativo cuando la base no está disponible, en lugar del error genérico del framework; se revisaron los mensajes de error de todo el proyecto para que estén en español y describan qué corregir sin revelar información de la cuenta; el registro separa nombres y apellidos en dos campos; el logotipo de AEUVG se presenta con mayor tamaño y enlaza a la página principal desde el encabezado, el pie y el panel; y el panel administrativo unificó las convocatorias de horas dentro de la sección de horas beca, y las postulaciones dentro de la sección de tutorías, quedando en nueve secciones.</w:t>
       </w:r>
     </w:p>
     <w:p>

</xml_diff>

<commit_message>
Arreglar bug sobre imagen.
</commit_message>
<xml_diff>
--- a/Documentos/AEUVG - Desarrollo Sprint 2.docx
+++ b/Documentos/AEUVG - Desarrollo Sprint 2.docx
@@ -1899,7 +1899,7 @@
           <w:sz w:val="24"/>
           <w:szCs w:val="24"/>
         </w:rPr>
-        <w:t xml:space="preserve">Las seis historias comprometidas para el Sprint 2 se encuentran completadas, con 31.4 horas de trabajo de equipo frente a las 34 estimadas. El detalle por sesión se encuentra en la sección 10. La plataforma cuenta ahora con:</w:t>
+        <w:t xml:space="preserve">Las seis historias comprometidas para el Sprint 2 se encuentran completadas, con 38.6 horas de trabajo de equipo frente a las 34 estimadas. El detalle por sesión se encuentra en la sección 10. La plataforma cuenta ahora con:</w:t>
       </w:r>
     </w:p>
     <w:p>
@@ -2133,7 +2133,7 @@
           <w:sz w:val="24"/>
           <w:szCs w:val="24"/>
         </w:rPr>
-        <w:t xml:space="preserve">El sprint sumó 31.4 horas de equipo: 18.1 horas de Harry Méndez y 13.3 horas de Juan Gabriel Gualim, frente a las 34 horas estimadas en la planificación. El trabajo real se ubicó cerca de un 7% por debajo de lo estimado, una desviación considerablemente menor a la del Sprint 1 y que confirma la recalibración hecha al inicio de este sprint.</w:t>
+        <w:t xml:space="preserve">El sprint sumó 38.6 horas de equipo: 22.4 horas de Harry Méndez y 16.3 horas de Juan Gabriel Gualim, frente a las 34 horas estimadas en la planificación, es decir, un 14% por encima de lo previsto. La diferencia corresponde al día de cierre: la revisión con AEUVG dejó observaciones que se resolvieron el mismo 23 de septiembre, antes de publicar la versión del sprint.</w:t>
       </w:r>
     </w:p>
     <w:p>
@@ -5869,6 +5869,926 @@
           </w:p>
         </w:tc>
       </w:tr>
+      <w:tr>
+        <w:tc>
+          <w:tcPr>
+            <w:tcW w:type="dxa" w:w="900"/>
+            <w:tcMar>
+              <w:top w:type="dxa" w:w="80"/>
+              <w:left w:type="dxa" w:w="120"/>
+              <w:bottom w:type="dxa" w:w="80"/>
+              <w:right w:type="dxa" w:w="120"/>
+            </w:tcMar>
+          </w:tcPr>
+          <w:p>
+            <w:pPr>
+              <w:spacing w:after="0"/>
+            </w:pPr>
+            <w:r>
+              <w:rPr>
+                <w:rFonts w:ascii="Times New Roman" w:cs="Times New Roman" w:eastAsia="Times New Roman" w:hAnsi="Times New Roman"/>
+                <w:b w:val="false"/>
+                <w:bCs w:val="false"/>
+                <w:sz w:val="24"/>
+                <w:szCs w:val="24"/>
+              </w:rPr>
+              <w:t xml:space="preserve">23/09/2026</w:t>
+            </w:r>
+          </w:p>
+        </w:tc>
+        <w:tc>
+          <w:tcPr>
+            <w:tcW w:type="dxa" w:w="680"/>
+            <w:tcMar>
+              <w:top w:type="dxa" w:w="80"/>
+              <w:left w:type="dxa" w:w="120"/>
+              <w:bottom w:type="dxa" w:w="80"/>
+              <w:right w:type="dxa" w:w="120"/>
+            </w:tcMar>
+          </w:tcPr>
+          <w:p>
+            <w:pPr>
+              <w:spacing w:after="0"/>
+            </w:pPr>
+            <w:r>
+              <w:rPr>
+                <w:rFonts w:ascii="Times New Roman" w:cs="Times New Roman" w:eastAsia="Times New Roman" w:hAnsi="Times New Roman"/>
+                <w:b w:val="false"/>
+                <w:bCs w:val="false"/>
+                <w:sz w:val="24"/>
+                <w:szCs w:val="24"/>
+              </w:rPr>
+              <w:t xml:space="preserve">11:20</w:t>
+            </w:r>
+          </w:p>
+        </w:tc>
+        <w:tc>
+          <w:tcPr>
+            <w:tcW w:type="dxa" w:w="680"/>
+            <w:tcMar>
+              <w:top w:type="dxa" w:w="80"/>
+              <w:left w:type="dxa" w:w="120"/>
+              <w:bottom w:type="dxa" w:w="80"/>
+              <w:right w:type="dxa" w:w="120"/>
+            </w:tcMar>
+          </w:tcPr>
+          <w:p>
+            <w:pPr>
+              <w:spacing w:after="0"/>
+            </w:pPr>
+            <w:r>
+              <w:rPr>
+                <w:rFonts w:ascii="Times New Roman" w:cs="Times New Roman" w:eastAsia="Times New Roman" w:hAnsi="Times New Roman"/>
+                <w:b w:val="false"/>
+                <w:bCs w:val="false"/>
+                <w:sz w:val="24"/>
+                <w:szCs w:val="24"/>
+              </w:rPr>
+              <w:t xml:space="preserve">12:40</w:t>
+            </w:r>
+          </w:p>
+        </w:tc>
+        <w:tc>
+          <w:tcPr>
+            <w:tcW w:type="dxa" w:w="1120"/>
+            <w:tcMar>
+              <w:top w:type="dxa" w:w="80"/>
+              <w:left w:type="dxa" w:w="120"/>
+              <w:bottom w:type="dxa" w:w="80"/>
+              <w:right w:type="dxa" w:w="120"/>
+            </w:tcMar>
+          </w:tcPr>
+          <w:p>
+            <w:pPr>
+              <w:spacing w:after="0"/>
+            </w:pPr>
+            <w:r>
+              <w:rPr>
+                <w:rFonts w:ascii="Times New Roman" w:cs="Times New Roman" w:eastAsia="Times New Roman" w:hAnsi="Times New Roman"/>
+                <w:b w:val="false"/>
+                <w:bCs w:val="false"/>
+                <w:sz w:val="24"/>
+                <w:szCs w:val="24"/>
+              </w:rPr>
+              <w:t xml:space="preserve">0:10</w:t>
+            </w:r>
+          </w:p>
+        </w:tc>
+        <w:tc>
+          <w:tcPr>
+            <w:tcW w:type="dxa" w:w="900"/>
+            <w:tcMar>
+              <w:top w:type="dxa" w:w="80"/>
+              <w:left w:type="dxa" w:w="120"/>
+              <w:bottom w:type="dxa" w:w="80"/>
+              <w:right w:type="dxa" w:w="120"/>
+            </w:tcMar>
+          </w:tcPr>
+          <w:p>
+            <w:pPr>
+              <w:spacing w:after="0"/>
+            </w:pPr>
+            <w:r>
+              <w:rPr>
+                <w:rFonts w:ascii="Times New Roman" w:cs="Times New Roman" w:eastAsia="Times New Roman" w:hAnsi="Times New Roman"/>
+                <w:b w:val="false"/>
+                <w:bCs w:val="false"/>
+                <w:sz w:val="24"/>
+                <w:szCs w:val="24"/>
+              </w:rPr>
+              <w:t xml:space="preserve">1:10</w:t>
+            </w:r>
+          </w:p>
+        </w:tc>
+        <w:tc>
+          <w:tcPr>
+            <w:tcW w:type="dxa" w:w="1280"/>
+            <w:tcMar>
+              <w:top w:type="dxa" w:w="80"/>
+              <w:left w:type="dxa" w:w="120"/>
+              <w:bottom w:type="dxa" w:w="80"/>
+              <w:right w:type="dxa" w:w="120"/>
+            </w:tcMar>
+          </w:tcPr>
+          <w:p>
+            <w:pPr>
+              <w:spacing w:after="0"/>
+            </w:pPr>
+            <w:r>
+              <w:rPr>
+                <w:rFonts w:ascii="Times New Roman" w:cs="Times New Roman" w:eastAsia="Times New Roman" w:hAnsi="Times New Roman"/>
+                <w:b w:val="false"/>
+                <w:bCs w:val="false"/>
+                <w:sz w:val="24"/>
+                <w:szCs w:val="24"/>
+              </w:rPr>
+              <w:t xml:space="preserve">Codificación</w:t>
+            </w:r>
+          </w:p>
+        </w:tc>
+        <w:tc>
+          <w:tcPr>
+            <w:tcW w:type="dxa" w:w="3800"/>
+            <w:tcMar>
+              <w:top w:type="dxa" w:w="80"/>
+              <w:left w:type="dxa" w:w="120"/>
+              <w:bottom w:type="dxa" w:w="80"/>
+              <w:right w:type="dxa" w:w="120"/>
+            </w:tcMar>
+          </w:tcPr>
+          <w:p>
+            <w:pPr>
+              <w:spacing w:after="0"/>
+            </w:pPr>
+            <w:r>
+              <w:rPr>
+                <w:rFonts w:ascii="Times New Roman" w:cs="Times New Roman" w:eastAsia="Times New Roman" w:hAnsi="Times New Roman"/>
+                <w:b w:val="false"/>
+                <w:bCs w:val="false"/>
+                <w:sz w:val="24"/>
+                <w:szCs w:val="24"/>
+              </w:rPr>
+              <w:t xml:space="preserve">AEUVG-81 Organizadores opcionales del evento. AEUVG-83 Mensaje explícito cuando la base no responde.</w:t>
+            </w:r>
+          </w:p>
+        </w:tc>
+      </w:tr>
+      <w:tr>
+        <w:tc>
+          <w:tcPr>
+            <w:tcW w:type="dxa" w:w="900"/>
+            <w:tcMar>
+              <w:top w:type="dxa" w:w="80"/>
+              <w:left w:type="dxa" w:w="120"/>
+              <w:bottom w:type="dxa" w:w="80"/>
+              <w:right w:type="dxa" w:w="120"/>
+            </w:tcMar>
+          </w:tcPr>
+          <w:p>
+            <w:pPr>
+              <w:spacing w:after="0"/>
+            </w:pPr>
+            <w:r>
+              <w:rPr>
+                <w:rFonts w:ascii="Times New Roman" w:cs="Times New Roman" w:eastAsia="Times New Roman" w:hAnsi="Times New Roman"/>
+                <w:b w:val="false"/>
+                <w:bCs w:val="false"/>
+                <w:sz w:val="24"/>
+                <w:szCs w:val="24"/>
+              </w:rPr>
+              <w:t xml:space="preserve">23/09/2026</w:t>
+            </w:r>
+          </w:p>
+        </w:tc>
+        <w:tc>
+          <w:tcPr>
+            <w:tcW w:type="dxa" w:w="680"/>
+            <w:tcMar>
+              <w:top w:type="dxa" w:w="80"/>
+              <w:left w:type="dxa" w:w="120"/>
+              <w:bottom w:type="dxa" w:w="80"/>
+              <w:right w:type="dxa" w:w="120"/>
+            </w:tcMar>
+          </w:tcPr>
+          <w:p>
+            <w:pPr>
+              <w:spacing w:after="0"/>
+            </w:pPr>
+            <w:r>
+              <w:rPr>
+                <w:rFonts w:ascii="Times New Roman" w:cs="Times New Roman" w:eastAsia="Times New Roman" w:hAnsi="Times New Roman"/>
+                <w:b w:val="false"/>
+                <w:bCs w:val="false"/>
+                <w:sz w:val="24"/>
+                <w:szCs w:val="24"/>
+              </w:rPr>
+              <w:t xml:space="preserve">14:10</w:t>
+            </w:r>
+          </w:p>
+        </w:tc>
+        <w:tc>
+          <w:tcPr>
+            <w:tcW w:type="dxa" w:w="680"/>
+            <w:tcMar>
+              <w:top w:type="dxa" w:w="80"/>
+              <w:left w:type="dxa" w:w="120"/>
+              <w:bottom w:type="dxa" w:w="80"/>
+              <w:right w:type="dxa" w:w="120"/>
+            </w:tcMar>
+          </w:tcPr>
+          <w:p>
+            <w:pPr>
+              <w:spacing w:after="0"/>
+            </w:pPr>
+            <w:r>
+              <w:rPr>
+                <w:rFonts w:ascii="Times New Roman" w:cs="Times New Roman" w:eastAsia="Times New Roman" w:hAnsi="Times New Roman"/>
+                <w:b w:val="false"/>
+                <w:bCs w:val="false"/>
+                <w:sz w:val="24"/>
+                <w:szCs w:val="24"/>
+              </w:rPr>
+              <w:t xml:space="preserve">15:40</w:t>
+            </w:r>
+          </w:p>
+        </w:tc>
+        <w:tc>
+          <w:tcPr>
+            <w:tcW w:type="dxa" w:w="1120"/>
+            <w:tcMar>
+              <w:top w:type="dxa" w:w="80"/>
+              <w:left w:type="dxa" w:w="120"/>
+              <w:bottom w:type="dxa" w:w="80"/>
+              <w:right w:type="dxa" w:w="120"/>
+            </w:tcMar>
+          </w:tcPr>
+          <w:p>
+            <w:pPr>
+              <w:spacing w:after="0"/>
+            </w:pPr>
+            <w:r>
+              <w:rPr>
+                <w:rFonts w:ascii="Times New Roman" w:cs="Times New Roman" w:eastAsia="Times New Roman" w:hAnsi="Times New Roman"/>
+                <w:b w:val="false"/>
+                <w:bCs w:val="false"/>
+                <w:sz w:val="24"/>
+                <w:szCs w:val="24"/>
+              </w:rPr>
+              <w:t xml:space="preserve">0:10</w:t>
+            </w:r>
+          </w:p>
+        </w:tc>
+        <w:tc>
+          <w:tcPr>
+            <w:tcW w:type="dxa" w:w="900"/>
+            <w:tcMar>
+              <w:top w:type="dxa" w:w="80"/>
+              <w:left w:type="dxa" w:w="120"/>
+              <w:bottom w:type="dxa" w:w="80"/>
+              <w:right w:type="dxa" w:w="120"/>
+            </w:tcMar>
+          </w:tcPr>
+          <w:p>
+            <w:pPr>
+              <w:spacing w:after="0"/>
+            </w:pPr>
+            <w:r>
+              <w:rPr>
+                <w:rFonts w:ascii="Times New Roman" w:cs="Times New Roman" w:eastAsia="Times New Roman" w:hAnsi="Times New Roman"/>
+                <w:b w:val="false"/>
+                <w:bCs w:val="false"/>
+                <w:sz w:val="24"/>
+                <w:szCs w:val="24"/>
+              </w:rPr>
+              <w:t xml:space="preserve">1:20</w:t>
+            </w:r>
+          </w:p>
+        </w:tc>
+        <w:tc>
+          <w:tcPr>
+            <w:tcW w:type="dxa" w:w="1280"/>
+            <w:tcMar>
+              <w:top w:type="dxa" w:w="80"/>
+              <w:left w:type="dxa" w:w="120"/>
+              <w:bottom w:type="dxa" w:w="80"/>
+              <w:right w:type="dxa" w:w="120"/>
+            </w:tcMar>
+          </w:tcPr>
+          <w:p>
+            <w:pPr>
+              <w:spacing w:after="0"/>
+            </w:pPr>
+            <w:r>
+              <w:rPr>
+                <w:rFonts w:ascii="Times New Roman" w:cs="Times New Roman" w:eastAsia="Times New Roman" w:hAnsi="Times New Roman"/>
+                <w:b w:val="false"/>
+                <w:bCs w:val="false"/>
+                <w:sz w:val="24"/>
+                <w:szCs w:val="24"/>
+              </w:rPr>
+              <w:t xml:space="preserve">Codificación</w:t>
+            </w:r>
+          </w:p>
+        </w:tc>
+        <w:tc>
+          <w:tcPr>
+            <w:tcW w:type="dxa" w:w="3800"/>
+            <w:tcMar>
+              <w:top w:type="dxa" w:w="80"/>
+              <w:left w:type="dxa" w:w="120"/>
+              <w:bottom w:type="dxa" w:w="80"/>
+              <w:right w:type="dxa" w:w="120"/>
+            </w:tcMar>
+          </w:tcPr>
+          <w:p>
+            <w:pPr>
+              <w:spacing w:after="0"/>
+            </w:pPr>
+            <w:r>
+              <w:rPr>
+                <w:rFonts w:ascii="Times New Roman" w:cs="Times New Roman" w:eastAsia="Times New Roman" w:hAnsi="Times New Roman"/>
+                <w:b w:val="false"/>
+                <w:bCs w:val="false"/>
+                <w:sz w:val="24"/>
+                <w:szCs w:val="24"/>
+              </w:rPr>
+              <w:t xml:space="preserve">AEUVG-84 Mensajes de error del registro. AEUVG-87 Unificación de secciones del panel. AEUVG-88 Correcciones del listado y del detalle. AEUVG-90 Carga de la información institucional.</w:t>
+            </w:r>
+          </w:p>
+        </w:tc>
+      </w:tr>
+      <w:tr>
+        <w:tc>
+          <w:tcPr>
+            <w:tcW w:type="dxa" w:w="900"/>
+            <w:tcMar>
+              <w:top w:type="dxa" w:w="80"/>
+              <w:left w:type="dxa" w:w="120"/>
+              <w:bottom w:type="dxa" w:w="80"/>
+              <w:right w:type="dxa" w:w="120"/>
+            </w:tcMar>
+          </w:tcPr>
+          <w:p>
+            <w:pPr>
+              <w:spacing w:after="0"/>
+            </w:pPr>
+            <w:r>
+              <w:rPr>
+                <w:rFonts w:ascii="Times New Roman" w:cs="Times New Roman" w:eastAsia="Times New Roman" w:hAnsi="Times New Roman"/>
+                <w:b w:val="false"/>
+                <w:bCs w:val="false"/>
+                <w:sz w:val="24"/>
+                <w:szCs w:val="24"/>
+              </w:rPr>
+              <w:t xml:space="preserve">23/09/2026</w:t>
+            </w:r>
+          </w:p>
+        </w:tc>
+        <w:tc>
+          <w:tcPr>
+            <w:tcW w:type="dxa" w:w="680"/>
+            <w:tcMar>
+              <w:top w:type="dxa" w:w="80"/>
+              <w:left w:type="dxa" w:w="120"/>
+              <w:bottom w:type="dxa" w:w="80"/>
+              <w:right w:type="dxa" w:w="120"/>
+            </w:tcMar>
+          </w:tcPr>
+          <w:p>
+            <w:pPr>
+              <w:spacing w:after="0"/>
+            </w:pPr>
+            <w:r>
+              <w:rPr>
+                <w:rFonts w:ascii="Times New Roman" w:cs="Times New Roman" w:eastAsia="Times New Roman" w:hAnsi="Times New Roman"/>
+                <w:b w:val="false"/>
+                <w:bCs w:val="false"/>
+                <w:sz w:val="24"/>
+                <w:szCs w:val="24"/>
+              </w:rPr>
+              <w:t xml:space="preserve">19:40</w:t>
+            </w:r>
+          </w:p>
+        </w:tc>
+        <w:tc>
+          <w:tcPr>
+            <w:tcW w:type="dxa" w:w="680"/>
+            <w:tcMar>
+              <w:top w:type="dxa" w:w="80"/>
+              <w:left w:type="dxa" w:w="120"/>
+              <w:bottom w:type="dxa" w:w="80"/>
+              <w:right w:type="dxa" w:w="120"/>
+            </w:tcMar>
+          </w:tcPr>
+          <w:p>
+            <w:pPr>
+              <w:spacing w:after="0"/>
+            </w:pPr>
+            <w:r>
+              <w:rPr>
+                <w:rFonts w:ascii="Times New Roman" w:cs="Times New Roman" w:eastAsia="Times New Roman" w:hAnsi="Times New Roman"/>
+                <w:b w:val="false"/>
+                <w:bCs w:val="false"/>
+                <w:sz w:val="24"/>
+                <w:szCs w:val="24"/>
+              </w:rPr>
+              <w:t xml:space="preserve">20:45</w:t>
+            </w:r>
+          </w:p>
+        </w:tc>
+        <w:tc>
+          <w:tcPr>
+            <w:tcW w:type="dxa" w:w="1120"/>
+            <w:tcMar>
+              <w:top w:type="dxa" w:w="80"/>
+              <w:left w:type="dxa" w:w="120"/>
+              <w:bottom w:type="dxa" w:w="80"/>
+              <w:right w:type="dxa" w:w="120"/>
+            </w:tcMar>
+          </w:tcPr>
+          <w:p>
+            <w:pPr>
+              <w:spacing w:after="0"/>
+            </w:pPr>
+            <w:r>
+              <w:rPr>
+                <w:rFonts w:ascii="Times New Roman" w:cs="Times New Roman" w:eastAsia="Times New Roman" w:hAnsi="Times New Roman"/>
+                <w:b w:val="false"/>
+                <w:bCs w:val="false"/>
+                <w:sz w:val="24"/>
+                <w:szCs w:val="24"/>
+              </w:rPr>
+              <w:t xml:space="preserve">0:10</w:t>
+            </w:r>
+          </w:p>
+        </w:tc>
+        <w:tc>
+          <w:tcPr>
+            <w:tcW w:type="dxa" w:w="900"/>
+            <w:tcMar>
+              <w:top w:type="dxa" w:w="80"/>
+              <w:left w:type="dxa" w:w="120"/>
+              <w:bottom w:type="dxa" w:w="80"/>
+              <w:right w:type="dxa" w:w="120"/>
+            </w:tcMar>
+          </w:tcPr>
+          <w:p>
+            <w:pPr>
+              <w:spacing w:after="0"/>
+            </w:pPr>
+            <w:r>
+              <w:rPr>
+                <w:rFonts w:ascii="Times New Roman" w:cs="Times New Roman" w:eastAsia="Times New Roman" w:hAnsi="Times New Roman"/>
+                <w:b w:val="false"/>
+                <w:bCs w:val="false"/>
+                <w:sz w:val="24"/>
+                <w:szCs w:val="24"/>
+              </w:rPr>
+              <w:t xml:space="preserve">0:55</w:t>
+            </w:r>
+          </w:p>
+        </w:tc>
+        <w:tc>
+          <w:tcPr>
+            <w:tcW w:type="dxa" w:w="1280"/>
+            <w:tcMar>
+              <w:top w:type="dxa" w:w="80"/>
+              <w:left w:type="dxa" w:w="120"/>
+              <w:bottom w:type="dxa" w:w="80"/>
+              <w:right w:type="dxa" w:w="120"/>
+            </w:tcMar>
+          </w:tcPr>
+          <w:p>
+            <w:pPr>
+              <w:spacing w:after="0"/>
+            </w:pPr>
+            <w:r>
+              <w:rPr>
+                <w:rFonts w:ascii="Times New Roman" w:cs="Times New Roman" w:eastAsia="Times New Roman" w:hAnsi="Times New Roman"/>
+                <w:b w:val="false"/>
+                <w:bCs w:val="false"/>
+                <w:sz w:val="24"/>
+                <w:szCs w:val="24"/>
+              </w:rPr>
+              <w:t xml:space="preserve">Codificación</w:t>
+            </w:r>
+          </w:p>
+        </w:tc>
+        <w:tc>
+          <w:tcPr>
+            <w:tcW w:type="dxa" w:w="3800"/>
+            <w:tcMar>
+              <w:top w:type="dxa" w:w="80"/>
+              <w:left w:type="dxa" w:w="120"/>
+              <w:bottom w:type="dxa" w:w="80"/>
+              <w:right w:type="dxa" w:w="120"/>
+            </w:tcMar>
+          </w:tcPr>
+          <w:p>
+            <w:pPr>
+              <w:spacing w:after="0"/>
+            </w:pPr>
+            <w:r>
+              <w:rPr>
+                <w:rFonts w:ascii="Times New Roman" w:cs="Times New Roman" w:eastAsia="Times New Roman" w:hAnsi="Times New Roman"/>
+                <w:b w:val="false"/>
+                <w:bCs w:val="false"/>
+                <w:sz w:val="24"/>
+                <w:szCs w:val="24"/>
+              </w:rPr>
+              <w:t xml:space="preserve">AEUVG-92 Operación de la base por túnel cifrado y migraciones en Railway. AEUVG-93 Envío del formulario de eventos. AEUVG-94 Volumen persistente para las imágenes.</w:t>
+            </w:r>
+          </w:p>
+        </w:tc>
+      </w:tr>
+      <w:tr>
+        <w:tc>
+          <w:tcPr>
+            <w:tcW w:type="dxa" w:w="900"/>
+            <w:tcMar>
+              <w:top w:type="dxa" w:w="80"/>
+              <w:left w:type="dxa" w:w="120"/>
+              <w:bottom w:type="dxa" w:w="80"/>
+              <w:right w:type="dxa" w:w="120"/>
+            </w:tcMar>
+          </w:tcPr>
+          <w:p>
+            <w:pPr>
+              <w:spacing w:after="0"/>
+            </w:pPr>
+            <w:r>
+              <w:rPr>
+                <w:rFonts w:ascii="Times New Roman" w:cs="Times New Roman" w:eastAsia="Times New Roman" w:hAnsi="Times New Roman"/>
+                <w:b w:val="false"/>
+                <w:bCs w:val="false"/>
+                <w:sz w:val="24"/>
+                <w:szCs w:val="24"/>
+              </w:rPr>
+              <w:t xml:space="preserve">23/09/2026</w:t>
+            </w:r>
+          </w:p>
+        </w:tc>
+        <w:tc>
+          <w:tcPr>
+            <w:tcW w:type="dxa" w:w="680"/>
+            <w:tcMar>
+              <w:top w:type="dxa" w:w="80"/>
+              <w:left w:type="dxa" w:w="120"/>
+              <w:bottom w:type="dxa" w:w="80"/>
+              <w:right w:type="dxa" w:w="120"/>
+            </w:tcMar>
+          </w:tcPr>
+          <w:p>
+            <w:pPr>
+              <w:spacing w:after="0"/>
+            </w:pPr>
+            <w:r>
+              <w:rPr>
+                <w:rFonts w:ascii="Times New Roman" w:cs="Times New Roman" w:eastAsia="Times New Roman" w:hAnsi="Times New Roman"/>
+                <w:b w:val="false"/>
+                <w:bCs w:val="false"/>
+                <w:sz w:val="24"/>
+                <w:szCs w:val="24"/>
+              </w:rPr>
+              <w:t xml:space="preserve">21:30</w:t>
+            </w:r>
+          </w:p>
+        </w:tc>
+        <w:tc>
+          <w:tcPr>
+            <w:tcW w:type="dxa" w:w="680"/>
+            <w:tcMar>
+              <w:top w:type="dxa" w:w="80"/>
+              <w:left w:type="dxa" w:w="120"/>
+              <w:bottom w:type="dxa" w:w="80"/>
+              <w:right w:type="dxa" w:w="120"/>
+            </w:tcMar>
+          </w:tcPr>
+          <w:p>
+            <w:pPr>
+              <w:spacing w:after="0"/>
+            </w:pPr>
+            <w:r>
+              <w:rPr>
+                <w:rFonts w:ascii="Times New Roman" w:cs="Times New Roman" w:eastAsia="Times New Roman" w:hAnsi="Times New Roman"/>
+                <w:b w:val="false"/>
+                <w:bCs w:val="false"/>
+                <w:sz w:val="24"/>
+                <w:szCs w:val="24"/>
+              </w:rPr>
+              <w:t xml:space="preserve">21:45</w:t>
+            </w:r>
+          </w:p>
+        </w:tc>
+        <w:tc>
+          <w:tcPr>
+            <w:tcW w:type="dxa" w:w="1120"/>
+            <w:tcMar>
+              <w:top w:type="dxa" w:w="80"/>
+              <w:left w:type="dxa" w:w="120"/>
+              <w:bottom w:type="dxa" w:w="80"/>
+              <w:right w:type="dxa" w:w="120"/>
+            </w:tcMar>
+          </w:tcPr>
+          <w:p>
+            <w:pPr>
+              <w:spacing w:after="0"/>
+            </w:pPr>
+            <w:r>
+              <w:rPr>
+                <w:rFonts w:ascii="Times New Roman" w:cs="Times New Roman" w:eastAsia="Times New Roman" w:hAnsi="Times New Roman"/>
+                <w:b w:val="false"/>
+                <w:bCs w:val="false"/>
+                <w:sz w:val="24"/>
+                <w:szCs w:val="24"/>
+              </w:rPr>
+              <w:t xml:space="preserve">0:00</w:t>
+            </w:r>
+          </w:p>
+        </w:tc>
+        <w:tc>
+          <w:tcPr>
+            <w:tcW w:type="dxa" w:w="900"/>
+            <w:tcMar>
+              <w:top w:type="dxa" w:w="80"/>
+              <w:left w:type="dxa" w:w="120"/>
+              <w:bottom w:type="dxa" w:w="80"/>
+              <w:right w:type="dxa" w:w="120"/>
+            </w:tcMar>
+          </w:tcPr>
+          <w:p>
+            <w:pPr>
+              <w:spacing w:after="0"/>
+            </w:pPr>
+            <w:r>
+              <w:rPr>
+                <w:rFonts w:ascii="Times New Roman" w:cs="Times New Roman" w:eastAsia="Times New Roman" w:hAnsi="Times New Roman"/>
+                <w:b w:val="false"/>
+                <w:bCs w:val="false"/>
+                <w:sz w:val="24"/>
+                <w:szCs w:val="24"/>
+              </w:rPr>
+              <w:t xml:space="preserve">0:15</w:t>
+            </w:r>
+          </w:p>
+        </w:tc>
+        <w:tc>
+          <w:tcPr>
+            <w:tcW w:type="dxa" w:w="1280"/>
+            <w:tcMar>
+              <w:top w:type="dxa" w:w="80"/>
+              <w:left w:type="dxa" w:w="120"/>
+              <w:bottom w:type="dxa" w:w="80"/>
+              <w:right w:type="dxa" w:w="120"/>
+            </w:tcMar>
+          </w:tcPr>
+          <w:p>
+            <w:pPr>
+              <w:spacing w:after="0"/>
+            </w:pPr>
+            <w:r>
+              <w:rPr>
+                <w:rFonts w:ascii="Times New Roman" w:cs="Times New Roman" w:eastAsia="Times New Roman" w:hAnsi="Times New Roman"/>
+                <w:b w:val="false"/>
+                <w:bCs w:val="false"/>
+                <w:sz w:val="24"/>
+                <w:szCs w:val="24"/>
+              </w:rPr>
+              <w:t xml:space="preserve">Integración</w:t>
+            </w:r>
+          </w:p>
+        </w:tc>
+        <w:tc>
+          <w:tcPr>
+            <w:tcW w:type="dxa" w:w="3800"/>
+            <w:tcMar>
+              <w:top w:type="dxa" w:w="80"/>
+              <w:left w:type="dxa" w:w="120"/>
+              <w:bottom w:type="dxa" w:w="80"/>
+              <w:right w:type="dxa" w:w="120"/>
+            </w:tcMar>
+          </w:tcPr>
+          <w:p>
+            <w:pPr>
+              <w:spacing w:after="0"/>
+            </w:pPr>
+            <w:r>
+              <w:rPr>
+                <w:rFonts w:ascii="Times New Roman" w:cs="Times New Roman" w:eastAsia="Times New Roman" w:hAnsi="Times New Roman"/>
+                <w:b w:val="false"/>
+                <w:bCs w:val="false"/>
+                <w:sz w:val="24"/>
+                <w:szCs w:val="24"/>
+              </w:rPr>
+              <w:t xml:space="preserve">Integración y publicación de los retratos de la Junta Directiva.</w:t>
+            </w:r>
+          </w:p>
+        </w:tc>
+      </w:tr>
+      <w:tr>
+        <w:tc>
+          <w:tcPr>
+            <w:tcW w:type="dxa" w:w="900"/>
+            <w:tcMar>
+              <w:top w:type="dxa" w:w="80"/>
+              <w:left w:type="dxa" w:w="120"/>
+              <w:bottom w:type="dxa" w:w="80"/>
+              <w:right w:type="dxa" w:w="120"/>
+            </w:tcMar>
+          </w:tcPr>
+          <w:p>
+            <w:pPr>
+              <w:spacing w:after="0"/>
+            </w:pPr>
+            <w:r>
+              <w:rPr>
+                <w:rFonts w:ascii="Times New Roman" w:cs="Times New Roman" w:eastAsia="Times New Roman" w:hAnsi="Times New Roman"/>
+                <w:b w:val="false"/>
+                <w:bCs w:val="false"/>
+                <w:sz w:val="24"/>
+                <w:szCs w:val="24"/>
+              </w:rPr>
+              <w:t xml:space="preserve">23/09/2026</w:t>
+            </w:r>
+          </w:p>
+        </w:tc>
+        <w:tc>
+          <w:tcPr>
+            <w:tcW w:type="dxa" w:w="680"/>
+            <w:tcMar>
+              <w:top w:type="dxa" w:w="80"/>
+              <w:left w:type="dxa" w:w="120"/>
+              <w:bottom w:type="dxa" w:w="80"/>
+              <w:right w:type="dxa" w:w="120"/>
+            </w:tcMar>
+          </w:tcPr>
+          <w:p>
+            <w:pPr>
+              <w:spacing w:after="0"/>
+            </w:pPr>
+            <w:r>
+              <w:rPr>
+                <w:rFonts w:ascii="Times New Roman" w:cs="Times New Roman" w:eastAsia="Times New Roman" w:hAnsi="Times New Roman"/>
+                <w:b w:val="false"/>
+                <w:bCs w:val="false"/>
+                <w:sz w:val="24"/>
+                <w:szCs w:val="24"/>
+              </w:rPr>
+              <w:t xml:space="preserve">22:45</w:t>
+            </w:r>
+          </w:p>
+        </w:tc>
+        <w:tc>
+          <w:tcPr>
+            <w:tcW w:type="dxa" w:w="680"/>
+            <w:tcMar>
+              <w:top w:type="dxa" w:w="80"/>
+              <w:left w:type="dxa" w:w="120"/>
+              <w:bottom w:type="dxa" w:w="80"/>
+              <w:right w:type="dxa" w:w="120"/>
+            </w:tcMar>
+          </w:tcPr>
+          <w:p>
+            <w:pPr>
+              <w:spacing w:after="0"/>
+            </w:pPr>
+            <w:r>
+              <w:rPr>
+                <w:rFonts w:ascii="Times New Roman" w:cs="Times New Roman" w:eastAsia="Times New Roman" w:hAnsi="Times New Roman"/>
+                <w:b w:val="false"/>
+                <w:bCs w:val="false"/>
+                <w:sz w:val="24"/>
+                <w:szCs w:val="24"/>
+              </w:rPr>
+              <w:t xml:space="preserve">23:20</w:t>
+            </w:r>
+          </w:p>
+        </w:tc>
+        <w:tc>
+          <w:tcPr>
+            <w:tcW w:type="dxa" w:w="1120"/>
+            <w:tcMar>
+              <w:top w:type="dxa" w:w="80"/>
+              <w:left w:type="dxa" w:w="120"/>
+              <w:bottom w:type="dxa" w:w="80"/>
+              <w:right w:type="dxa" w:w="120"/>
+            </w:tcMar>
+          </w:tcPr>
+          <w:p>
+            <w:pPr>
+              <w:spacing w:after="0"/>
+            </w:pPr>
+            <w:r>
+              <w:rPr>
+                <w:rFonts w:ascii="Times New Roman" w:cs="Times New Roman" w:eastAsia="Times New Roman" w:hAnsi="Times New Roman"/>
+                <w:b w:val="false"/>
+                <w:bCs w:val="false"/>
+                <w:sz w:val="24"/>
+                <w:szCs w:val="24"/>
+              </w:rPr>
+              <w:t xml:space="preserve">0:00</w:t>
+            </w:r>
+          </w:p>
+        </w:tc>
+        <w:tc>
+          <w:tcPr>
+            <w:tcW w:type="dxa" w:w="900"/>
+            <w:tcMar>
+              <w:top w:type="dxa" w:w="80"/>
+              <w:left w:type="dxa" w:w="120"/>
+              <w:bottom w:type="dxa" w:w="80"/>
+              <w:right w:type="dxa" w:w="120"/>
+            </w:tcMar>
+          </w:tcPr>
+          <w:p>
+            <w:pPr>
+              <w:spacing w:after="0"/>
+            </w:pPr>
+            <w:r>
+              <w:rPr>
+                <w:rFonts w:ascii="Times New Roman" w:cs="Times New Roman" w:eastAsia="Times New Roman" w:hAnsi="Times New Roman"/>
+                <w:b w:val="false"/>
+                <w:bCs w:val="false"/>
+                <w:sz w:val="24"/>
+                <w:szCs w:val="24"/>
+              </w:rPr>
+              <w:t xml:space="preserve">0:35</w:t>
+            </w:r>
+          </w:p>
+        </w:tc>
+        <w:tc>
+          <w:tcPr>
+            <w:tcW w:type="dxa" w:w="1280"/>
+            <w:tcMar>
+              <w:top w:type="dxa" w:w="80"/>
+              <w:left w:type="dxa" w:w="120"/>
+              <w:bottom w:type="dxa" w:w="80"/>
+              <w:right w:type="dxa" w:w="120"/>
+            </w:tcMar>
+          </w:tcPr>
+          <w:p>
+            <w:pPr>
+              <w:spacing w:after="0"/>
+            </w:pPr>
+            <w:r>
+              <w:rPr>
+                <w:rFonts w:ascii="Times New Roman" w:cs="Times New Roman" w:eastAsia="Times New Roman" w:hAnsi="Times New Roman"/>
+                <w:b w:val="false"/>
+                <w:bCs w:val="false"/>
+                <w:sz w:val="24"/>
+                <w:szCs w:val="24"/>
+              </w:rPr>
+              <w:t xml:space="preserve">Documentación</w:t>
+            </w:r>
+          </w:p>
+        </w:tc>
+        <w:tc>
+          <w:tcPr>
+            <w:tcW w:type="dxa" w:w="3800"/>
+            <w:tcMar>
+              <w:top w:type="dxa" w:w="80"/>
+              <w:left w:type="dxa" w:w="120"/>
+              <w:bottom w:type="dxa" w:w="80"/>
+              <w:right w:type="dxa" w:w="120"/>
+            </w:tcMar>
+          </w:tcPr>
+          <w:p>
+            <w:pPr>
+              <w:spacing w:after="0"/>
+            </w:pPr>
+            <w:r>
+              <w:rPr>
+                <w:rFonts w:ascii="Times New Roman" w:cs="Times New Roman" w:eastAsia="Times New Roman" w:hAnsi="Times New Roman"/>
+                <w:b w:val="false"/>
+                <w:bCs w:val="false"/>
+                <w:sz w:val="24"/>
+                <w:szCs w:val="24"/>
+              </w:rPr>
+              <w:t xml:space="preserve">Integración de los ajustes de interfaz a main y actualización del documento del sprint.</w:t>
+            </w:r>
+          </w:p>
+        </w:tc>
+      </w:tr>
     </w:tbl>
     <w:p>
       <w:pPr>
@@ -6472,7 +7392,7 @@
                 <w:sz w:val="24"/>
                 <w:szCs w:val="24"/>
               </w:rPr>
-              <w:t xml:space="preserve">3.7</w:t>
+              <w:t xml:space="preserve">3.8</w:t>
             </w:r>
           </w:p>
         </w:tc>
@@ -6606,7 +7526,7 @@
                 <w:sz w:val="24"/>
                 <w:szCs w:val="24"/>
               </w:rPr>
-              <w:t xml:space="preserve">0:55</w:t>
+              <w:t xml:space="preserve">4:35</w:t>
             </w:r>
           </w:p>
         </w:tc>
@@ -6632,7 +7552,7 @@
                 <w:sz w:val="24"/>
                 <w:szCs w:val="24"/>
               </w:rPr>
-              <w:t xml:space="preserve">0.9</w:t>
+              <w:t xml:space="preserve">4.5</w:t>
             </w:r>
           </w:p>
         </w:tc>
@@ -6686,7 +7606,7 @@
                 <w:sz w:val="24"/>
                 <w:szCs w:val="24"/>
               </w:rPr>
-              <w:t xml:space="preserve">3:10</w:t>
+              <w:t xml:space="preserve">3:45</w:t>
             </w:r>
           </w:p>
         </w:tc>
@@ -6712,7 +7632,7 @@
                 <w:sz w:val="24"/>
                 <w:szCs w:val="24"/>
               </w:rPr>
-              <w:t xml:space="preserve">3.2</w:t>
+              <w:t xml:space="preserve">3.8</w:t>
             </w:r>
           </w:p>
         </w:tc>
@@ -6766,7 +7686,7 @@
                 <w:sz w:val="24"/>
                 <w:szCs w:val="24"/>
               </w:rPr>
-              <w:t xml:space="preserve">18:08</w:t>
+              <w:t xml:space="preserve">22:23</w:t>
             </w:r>
           </w:p>
         </w:tc>
@@ -6792,7 +7712,7 @@
                 <w:sz w:val="24"/>
                 <w:szCs w:val="24"/>
               </w:rPr>
-              <w:t xml:space="preserve">18.1</w:t>
+              <w:t xml:space="preserve">22.4</w:t>
             </w:r>
           </w:p>
         </w:tc>
@@ -10163,6 +11083,558 @@
           </w:p>
         </w:tc>
       </w:tr>
+      <w:tr>
+        <w:tc>
+          <w:tcPr>
+            <w:tcW w:type="dxa" w:w="900"/>
+            <w:tcMar>
+              <w:top w:type="dxa" w:w="80"/>
+              <w:left w:type="dxa" w:w="120"/>
+              <w:bottom w:type="dxa" w:w="80"/>
+              <w:right w:type="dxa" w:w="120"/>
+            </w:tcMar>
+          </w:tcPr>
+          <w:p>
+            <w:pPr>
+              <w:spacing w:after="0"/>
+            </w:pPr>
+            <w:r>
+              <w:rPr>
+                <w:rFonts w:ascii="Times New Roman" w:cs="Times New Roman" w:eastAsia="Times New Roman" w:hAnsi="Times New Roman"/>
+                <w:b w:val="false"/>
+                <w:bCs w:val="false"/>
+                <w:sz w:val="24"/>
+                <w:szCs w:val="24"/>
+              </w:rPr>
+              <w:t xml:space="preserve">23/09/2026</w:t>
+            </w:r>
+          </w:p>
+        </w:tc>
+        <w:tc>
+          <w:tcPr>
+            <w:tcW w:type="dxa" w:w="680"/>
+            <w:tcMar>
+              <w:top w:type="dxa" w:w="80"/>
+              <w:left w:type="dxa" w:w="120"/>
+              <w:bottom w:type="dxa" w:w="80"/>
+              <w:right w:type="dxa" w:w="120"/>
+            </w:tcMar>
+          </w:tcPr>
+          <w:p>
+            <w:pPr>
+              <w:spacing w:after="0"/>
+            </w:pPr>
+            <w:r>
+              <w:rPr>
+                <w:rFonts w:ascii="Times New Roman" w:cs="Times New Roman" w:eastAsia="Times New Roman" w:hAnsi="Times New Roman"/>
+                <w:b w:val="false"/>
+                <w:bCs w:val="false"/>
+                <w:sz w:val="24"/>
+                <w:szCs w:val="24"/>
+              </w:rPr>
+              <w:t xml:space="preserve">11:30</w:t>
+            </w:r>
+          </w:p>
+        </w:tc>
+        <w:tc>
+          <w:tcPr>
+            <w:tcW w:type="dxa" w:w="680"/>
+            <w:tcMar>
+              <w:top w:type="dxa" w:w="80"/>
+              <w:left w:type="dxa" w:w="120"/>
+              <w:bottom w:type="dxa" w:w="80"/>
+              <w:right w:type="dxa" w:w="120"/>
+            </w:tcMar>
+          </w:tcPr>
+          <w:p>
+            <w:pPr>
+              <w:spacing w:after="0"/>
+            </w:pPr>
+            <w:r>
+              <w:rPr>
+                <w:rFonts w:ascii="Times New Roman" w:cs="Times New Roman" w:eastAsia="Times New Roman" w:hAnsi="Times New Roman"/>
+                <w:b w:val="false"/>
+                <w:bCs w:val="false"/>
+                <w:sz w:val="24"/>
+                <w:szCs w:val="24"/>
+              </w:rPr>
+              <w:t xml:space="preserve">12:40</w:t>
+            </w:r>
+          </w:p>
+        </w:tc>
+        <w:tc>
+          <w:tcPr>
+            <w:tcW w:type="dxa" w:w="1120"/>
+            <w:tcMar>
+              <w:top w:type="dxa" w:w="80"/>
+              <w:left w:type="dxa" w:w="120"/>
+              <w:bottom w:type="dxa" w:w="80"/>
+              <w:right w:type="dxa" w:w="120"/>
+            </w:tcMar>
+          </w:tcPr>
+          <w:p>
+            <w:pPr>
+              <w:spacing w:after="0"/>
+            </w:pPr>
+            <w:r>
+              <w:rPr>
+                <w:rFonts w:ascii="Times New Roman" w:cs="Times New Roman" w:eastAsia="Times New Roman" w:hAnsi="Times New Roman"/>
+                <w:b w:val="false"/>
+                <w:bCs w:val="false"/>
+                <w:sz w:val="24"/>
+                <w:szCs w:val="24"/>
+              </w:rPr>
+              <w:t xml:space="preserve">0:10</w:t>
+            </w:r>
+          </w:p>
+        </w:tc>
+        <w:tc>
+          <w:tcPr>
+            <w:tcW w:type="dxa" w:w="900"/>
+            <w:tcMar>
+              <w:top w:type="dxa" w:w="80"/>
+              <w:left w:type="dxa" w:w="120"/>
+              <w:bottom w:type="dxa" w:w="80"/>
+              <w:right w:type="dxa" w:w="120"/>
+            </w:tcMar>
+          </w:tcPr>
+          <w:p>
+            <w:pPr>
+              <w:spacing w:after="0"/>
+            </w:pPr>
+            <w:r>
+              <w:rPr>
+                <w:rFonts w:ascii="Times New Roman" w:cs="Times New Roman" w:eastAsia="Times New Roman" w:hAnsi="Times New Roman"/>
+                <w:b w:val="false"/>
+                <w:bCs w:val="false"/>
+                <w:sz w:val="24"/>
+                <w:szCs w:val="24"/>
+              </w:rPr>
+              <w:t xml:space="preserve">1:00</w:t>
+            </w:r>
+          </w:p>
+        </w:tc>
+        <w:tc>
+          <w:tcPr>
+            <w:tcW w:type="dxa" w:w="1280"/>
+            <w:tcMar>
+              <w:top w:type="dxa" w:w="80"/>
+              <w:left w:type="dxa" w:w="120"/>
+              <w:bottom w:type="dxa" w:w="80"/>
+              <w:right w:type="dxa" w:w="120"/>
+            </w:tcMar>
+          </w:tcPr>
+          <w:p>
+            <w:pPr>
+              <w:spacing w:after="0"/>
+            </w:pPr>
+            <w:r>
+              <w:rPr>
+                <w:rFonts w:ascii="Times New Roman" w:cs="Times New Roman" w:eastAsia="Times New Roman" w:hAnsi="Times New Roman"/>
+                <w:b w:val="false"/>
+                <w:bCs w:val="false"/>
+                <w:sz w:val="24"/>
+                <w:szCs w:val="24"/>
+              </w:rPr>
+              <w:t xml:space="preserve">Codificación</w:t>
+            </w:r>
+          </w:p>
+        </w:tc>
+        <w:tc>
+          <w:tcPr>
+            <w:tcW w:type="dxa" w:w="3800"/>
+            <w:tcMar>
+              <w:top w:type="dxa" w:w="80"/>
+              <w:left w:type="dxa" w:w="120"/>
+              <w:bottom w:type="dxa" w:w="80"/>
+              <w:right w:type="dxa" w:w="120"/>
+            </w:tcMar>
+          </w:tcPr>
+          <w:p>
+            <w:pPr>
+              <w:spacing w:after="0"/>
+            </w:pPr>
+            <w:r>
+              <w:rPr>
+                <w:rFonts w:ascii="Times New Roman" w:cs="Times New Roman" w:eastAsia="Times New Roman" w:hAnsi="Times New Roman"/>
+                <w:b w:val="false"/>
+                <w:bCs w:val="false"/>
+                <w:sz w:val="24"/>
+                <w:szCs w:val="24"/>
+              </w:rPr>
+              <w:t xml:space="preserve">AEUVG-82 Resumen de los campos que impiden guardar. AEUVG-85 Nombres y apellidos separados. AEUVG-86 Logotipo ampliado y enlazado al inicio.</w:t>
+            </w:r>
+          </w:p>
+        </w:tc>
+      </w:tr>
+      <w:tr>
+        <w:tc>
+          <w:tcPr>
+            <w:tcW w:type="dxa" w:w="900"/>
+            <w:tcMar>
+              <w:top w:type="dxa" w:w="80"/>
+              <w:left w:type="dxa" w:w="120"/>
+              <w:bottom w:type="dxa" w:w="80"/>
+              <w:right w:type="dxa" w:w="120"/>
+            </w:tcMar>
+          </w:tcPr>
+          <w:p>
+            <w:pPr>
+              <w:spacing w:after="0"/>
+            </w:pPr>
+            <w:r>
+              <w:rPr>
+                <w:rFonts w:ascii="Times New Roman" w:cs="Times New Roman" w:eastAsia="Times New Roman" w:hAnsi="Times New Roman"/>
+                <w:b w:val="false"/>
+                <w:bCs w:val="false"/>
+                <w:sz w:val="24"/>
+                <w:szCs w:val="24"/>
+              </w:rPr>
+              <w:t xml:space="preserve">23/09/2026</w:t>
+            </w:r>
+          </w:p>
+        </w:tc>
+        <w:tc>
+          <w:tcPr>
+            <w:tcW w:type="dxa" w:w="680"/>
+            <w:tcMar>
+              <w:top w:type="dxa" w:w="80"/>
+              <w:left w:type="dxa" w:w="120"/>
+              <w:bottom w:type="dxa" w:w="80"/>
+              <w:right w:type="dxa" w:w="120"/>
+            </w:tcMar>
+          </w:tcPr>
+          <w:p>
+            <w:pPr>
+              <w:spacing w:after="0"/>
+            </w:pPr>
+            <w:r>
+              <w:rPr>
+                <w:rFonts w:ascii="Times New Roman" w:cs="Times New Roman" w:eastAsia="Times New Roman" w:hAnsi="Times New Roman"/>
+                <w:b w:val="false"/>
+                <w:bCs w:val="false"/>
+                <w:sz w:val="24"/>
+                <w:szCs w:val="24"/>
+              </w:rPr>
+              <w:t xml:space="preserve">15:05</w:t>
+            </w:r>
+          </w:p>
+        </w:tc>
+        <w:tc>
+          <w:tcPr>
+            <w:tcW w:type="dxa" w:w="680"/>
+            <w:tcMar>
+              <w:top w:type="dxa" w:w="80"/>
+              <w:left w:type="dxa" w:w="120"/>
+              <w:bottom w:type="dxa" w:w="80"/>
+              <w:right w:type="dxa" w:w="120"/>
+            </w:tcMar>
+          </w:tcPr>
+          <w:p>
+            <w:pPr>
+              <w:spacing w:after="0"/>
+            </w:pPr>
+            <w:r>
+              <w:rPr>
+                <w:rFonts w:ascii="Times New Roman" w:cs="Times New Roman" w:eastAsia="Times New Roman" w:hAnsi="Times New Roman"/>
+                <w:b w:val="false"/>
+                <w:bCs w:val="false"/>
+                <w:sz w:val="24"/>
+                <w:szCs w:val="24"/>
+              </w:rPr>
+              <w:t xml:space="preserve">15:45</w:t>
+            </w:r>
+          </w:p>
+        </w:tc>
+        <w:tc>
+          <w:tcPr>
+            <w:tcW w:type="dxa" w:w="1120"/>
+            <w:tcMar>
+              <w:top w:type="dxa" w:w="80"/>
+              <w:left w:type="dxa" w:w="120"/>
+              <w:bottom w:type="dxa" w:w="80"/>
+              <w:right w:type="dxa" w:w="120"/>
+            </w:tcMar>
+          </w:tcPr>
+          <w:p>
+            <w:pPr>
+              <w:spacing w:after="0"/>
+            </w:pPr>
+            <w:r>
+              <w:rPr>
+                <w:rFonts w:ascii="Times New Roman" w:cs="Times New Roman" w:eastAsia="Times New Roman" w:hAnsi="Times New Roman"/>
+                <w:b w:val="false"/>
+                <w:bCs w:val="false"/>
+                <w:sz w:val="24"/>
+                <w:szCs w:val="24"/>
+              </w:rPr>
+              <w:t xml:space="preserve">0:05</w:t>
+            </w:r>
+          </w:p>
+        </w:tc>
+        <w:tc>
+          <w:tcPr>
+            <w:tcW w:type="dxa" w:w="900"/>
+            <w:tcMar>
+              <w:top w:type="dxa" w:w="80"/>
+              <w:left w:type="dxa" w:w="120"/>
+              <w:bottom w:type="dxa" w:w="80"/>
+              <w:right w:type="dxa" w:w="120"/>
+            </w:tcMar>
+          </w:tcPr>
+          <w:p>
+            <w:pPr>
+              <w:spacing w:after="0"/>
+            </w:pPr>
+            <w:r>
+              <w:rPr>
+                <w:rFonts w:ascii="Times New Roman" w:cs="Times New Roman" w:eastAsia="Times New Roman" w:hAnsi="Times New Roman"/>
+                <w:b w:val="false"/>
+                <w:bCs w:val="false"/>
+                <w:sz w:val="24"/>
+                <w:szCs w:val="24"/>
+              </w:rPr>
+              <w:t xml:space="preserve">0:35</w:t>
+            </w:r>
+          </w:p>
+        </w:tc>
+        <w:tc>
+          <w:tcPr>
+            <w:tcW w:type="dxa" w:w="1280"/>
+            <w:tcMar>
+              <w:top w:type="dxa" w:w="80"/>
+              <w:left w:type="dxa" w:w="120"/>
+              <w:bottom w:type="dxa" w:w="80"/>
+              <w:right w:type="dxa" w:w="120"/>
+            </w:tcMar>
+          </w:tcPr>
+          <w:p>
+            <w:pPr>
+              <w:spacing w:after="0"/>
+            </w:pPr>
+            <w:r>
+              <w:rPr>
+                <w:rFonts w:ascii="Times New Roman" w:cs="Times New Roman" w:eastAsia="Times New Roman" w:hAnsi="Times New Roman"/>
+                <w:b w:val="false"/>
+                <w:bCs w:val="false"/>
+                <w:sz w:val="24"/>
+                <w:szCs w:val="24"/>
+              </w:rPr>
+              <w:t xml:space="preserve">Diseño y codificación</w:t>
+            </w:r>
+          </w:p>
+        </w:tc>
+        <w:tc>
+          <w:tcPr>
+            <w:tcW w:type="dxa" w:w="3800"/>
+            <w:tcMar>
+              <w:top w:type="dxa" w:w="80"/>
+              <w:left w:type="dxa" w:w="120"/>
+              <w:bottom w:type="dxa" w:w="80"/>
+              <w:right w:type="dxa" w:w="120"/>
+            </w:tcMar>
+          </w:tcPr>
+          <w:p>
+            <w:pPr>
+              <w:spacing w:after="0"/>
+            </w:pPr>
+            <w:r>
+              <w:rPr>
+                <w:rFonts w:ascii="Times New Roman" w:cs="Times New Roman" w:eastAsia="Times New Roman" w:hAnsi="Times New Roman"/>
+                <w:b w:val="false"/>
+                <w:bCs w:val="false"/>
+                <w:sz w:val="24"/>
+                <w:szCs w:val="24"/>
+              </w:rPr>
+              <w:t xml:space="preserve">AEUVG-89 Fotografías de la Junta Directiva. AEUVG-91 Presentación de la Junta Directiva en la página institucional.</w:t>
+            </w:r>
+          </w:p>
+        </w:tc>
+      </w:tr>
+      <w:tr>
+        <w:tc>
+          <w:tcPr>
+            <w:tcW w:type="dxa" w:w="900"/>
+            <w:tcMar>
+              <w:top w:type="dxa" w:w="80"/>
+              <w:left w:type="dxa" w:w="120"/>
+              <w:bottom w:type="dxa" w:w="80"/>
+              <w:right w:type="dxa" w:w="120"/>
+            </w:tcMar>
+          </w:tcPr>
+          <w:p>
+            <w:pPr>
+              <w:spacing w:after="0"/>
+            </w:pPr>
+            <w:r>
+              <w:rPr>
+                <w:rFonts w:ascii="Times New Roman" w:cs="Times New Roman" w:eastAsia="Times New Roman" w:hAnsi="Times New Roman"/>
+                <w:b w:val="false"/>
+                <w:bCs w:val="false"/>
+                <w:sz w:val="24"/>
+                <w:szCs w:val="24"/>
+              </w:rPr>
+              <w:t xml:space="preserve">23/09/2026</w:t>
+            </w:r>
+          </w:p>
+        </w:tc>
+        <w:tc>
+          <w:tcPr>
+            <w:tcW w:type="dxa" w:w="680"/>
+            <w:tcMar>
+              <w:top w:type="dxa" w:w="80"/>
+              <w:left w:type="dxa" w:w="120"/>
+              <w:bottom w:type="dxa" w:w="80"/>
+              <w:right w:type="dxa" w:w="120"/>
+            </w:tcMar>
+          </w:tcPr>
+          <w:p>
+            <w:pPr>
+              <w:spacing w:after="0"/>
+            </w:pPr>
+            <w:r>
+              <w:rPr>
+                <w:rFonts w:ascii="Times New Roman" w:cs="Times New Roman" w:eastAsia="Times New Roman" w:hAnsi="Times New Roman"/>
+                <w:b w:val="false"/>
+                <w:bCs w:val="false"/>
+                <w:sz w:val="24"/>
+                <w:szCs w:val="24"/>
+              </w:rPr>
+              <w:t xml:space="preserve">21:10</w:t>
+            </w:r>
+          </w:p>
+        </w:tc>
+        <w:tc>
+          <w:tcPr>
+            <w:tcW w:type="dxa" w:w="680"/>
+            <w:tcMar>
+              <w:top w:type="dxa" w:w="80"/>
+              <w:left w:type="dxa" w:w="120"/>
+              <w:bottom w:type="dxa" w:w="80"/>
+              <w:right w:type="dxa" w:w="120"/>
+            </w:tcMar>
+          </w:tcPr>
+          <w:p>
+            <w:pPr>
+              <w:spacing w:after="0"/>
+            </w:pPr>
+            <w:r>
+              <w:rPr>
+                <w:rFonts w:ascii="Times New Roman" w:cs="Times New Roman" w:eastAsia="Times New Roman" w:hAnsi="Times New Roman"/>
+                <w:b w:val="false"/>
+                <w:bCs w:val="false"/>
+                <w:sz w:val="24"/>
+                <w:szCs w:val="24"/>
+              </w:rPr>
+              <w:t xml:space="preserve">22:40</w:t>
+            </w:r>
+          </w:p>
+        </w:tc>
+        <w:tc>
+          <w:tcPr>
+            <w:tcW w:type="dxa" w:w="1120"/>
+            <w:tcMar>
+              <w:top w:type="dxa" w:w="80"/>
+              <w:left w:type="dxa" w:w="120"/>
+              <w:bottom w:type="dxa" w:w="80"/>
+              <w:right w:type="dxa" w:w="120"/>
+            </w:tcMar>
+          </w:tcPr>
+          <w:p>
+            <w:pPr>
+              <w:spacing w:after="0"/>
+            </w:pPr>
+            <w:r>
+              <w:rPr>
+                <w:rFonts w:ascii="Times New Roman" w:cs="Times New Roman" w:eastAsia="Times New Roman" w:hAnsi="Times New Roman"/>
+                <w:b w:val="false"/>
+                <w:bCs w:val="false"/>
+                <w:sz w:val="24"/>
+                <w:szCs w:val="24"/>
+              </w:rPr>
+              <w:t xml:space="preserve">0:05</w:t>
+            </w:r>
+          </w:p>
+        </w:tc>
+        <w:tc>
+          <w:tcPr>
+            <w:tcW w:type="dxa" w:w="900"/>
+            <w:tcMar>
+              <w:top w:type="dxa" w:w="80"/>
+              <w:left w:type="dxa" w:w="120"/>
+              <w:bottom w:type="dxa" w:w="80"/>
+              <w:right w:type="dxa" w:w="120"/>
+            </w:tcMar>
+          </w:tcPr>
+          <w:p>
+            <w:pPr>
+              <w:spacing w:after="0"/>
+            </w:pPr>
+            <w:r>
+              <w:rPr>
+                <w:rFonts w:ascii="Times New Roman" w:cs="Times New Roman" w:eastAsia="Times New Roman" w:hAnsi="Times New Roman"/>
+                <w:b w:val="false"/>
+                <w:bCs w:val="false"/>
+                <w:sz w:val="24"/>
+                <w:szCs w:val="24"/>
+              </w:rPr>
+              <w:t xml:space="preserve">1:25</w:t>
+            </w:r>
+          </w:p>
+        </w:tc>
+        <w:tc>
+          <w:tcPr>
+            <w:tcW w:type="dxa" w:w="1280"/>
+            <w:tcMar>
+              <w:top w:type="dxa" w:w="80"/>
+              <w:left w:type="dxa" w:w="120"/>
+              <w:bottom w:type="dxa" w:w="80"/>
+              <w:right w:type="dxa" w:w="120"/>
+            </w:tcMar>
+          </w:tcPr>
+          <w:p>
+            <w:pPr>
+              <w:spacing w:after="0"/>
+            </w:pPr>
+            <w:r>
+              <w:rPr>
+                <w:rFonts w:ascii="Times New Roman" w:cs="Times New Roman" w:eastAsia="Times New Roman" w:hAnsi="Times New Roman"/>
+                <w:b w:val="false"/>
+                <w:bCs w:val="false"/>
+                <w:sz w:val="24"/>
+                <w:szCs w:val="24"/>
+              </w:rPr>
+              <w:t xml:space="preserve">Diseño y codificación</w:t>
+            </w:r>
+          </w:p>
+        </w:tc>
+        <w:tc>
+          <w:tcPr>
+            <w:tcW w:type="dxa" w:w="3800"/>
+            <w:tcMar>
+              <w:top w:type="dxa" w:w="80"/>
+              <w:left w:type="dxa" w:w="120"/>
+              <w:bottom w:type="dxa" w:w="80"/>
+              <w:right w:type="dxa" w:w="120"/>
+            </w:tcMar>
+          </w:tcPr>
+          <w:p>
+            <w:pPr>
+              <w:spacing w:after="0"/>
+            </w:pPr>
+            <w:r>
+              <w:rPr>
+                <w:rFonts w:ascii="Times New Roman" w:cs="Times New Roman" w:eastAsia="Times New Roman" w:hAnsi="Times New Roman"/>
+                <w:b w:val="false"/>
+                <w:bCs w:val="false"/>
+                <w:sz w:val="24"/>
+                <w:szCs w:val="24"/>
+              </w:rPr>
+              <w:t xml:space="preserve">AEUVG-95 Retratos sin fondo de estudio. AEUVG-96 Menú de la cuenta. AEUVG-97 Detalle del evento a dos columnas. AEUVG-98 Filtros plegables.</w:t>
+            </w:r>
+          </w:p>
+        </w:tc>
+      </w:tr>
     </w:tbl>
     <w:p>
       <w:pPr>
@@ -10900,7 +12372,7 @@
                 <w:sz w:val="24"/>
                 <w:szCs w:val="24"/>
               </w:rPr>
-              <w:t xml:space="preserve">1:35</w:t>
+              <w:t xml:space="preserve">4:35</w:t>
             </w:r>
           </w:p>
         </w:tc>
@@ -10926,7 +12398,7 @@
                 <w:sz w:val="24"/>
                 <w:szCs w:val="24"/>
               </w:rPr>
-              <w:t xml:space="preserve">1.6</w:t>
+              <w:t xml:space="preserve">4.6</w:t>
             </w:r>
           </w:p>
         </w:tc>
@@ -10980,7 +12452,7 @@
                 <w:sz w:val="24"/>
                 <w:szCs w:val="24"/>
               </w:rPr>
-              <w:t xml:space="preserve">13:15</w:t>
+              <w:t xml:space="preserve">16:15</w:t>
             </w:r>
           </w:p>
         </w:tc>
@@ -11006,7 +12478,7 @@
                 <w:sz w:val="24"/>
                 <w:szCs w:val="24"/>
               </w:rPr>
-              <w:t xml:space="preserve">13.3</w:t>
+              <w:t xml:space="preserve">16.3</w:t>
             </w:r>
           </w:p>
         </w:tc>
@@ -11214,7 +12686,7 @@
                 <w:sz w:val="24"/>
                 <w:szCs w:val="24"/>
               </w:rPr>
-              <w:t xml:space="preserve">19</w:t>
+              <w:t xml:space="preserve">24</w:t>
             </w:r>
           </w:p>
         </w:tc>
@@ -11240,7 +12712,7 @@
                 <w:sz w:val="24"/>
                 <w:szCs w:val="24"/>
               </w:rPr>
-              <w:t xml:space="preserve">18:08</w:t>
+              <w:t xml:space="preserve">22:23</w:t>
             </w:r>
           </w:p>
         </w:tc>
@@ -11266,7 +12738,7 @@
                 <w:sz w:val="24"/>
                 <w:szCs w:val="24"/>
               </w:rPr>
-              <w:t xml:space="preserve">18.1</w:t>
+              <w:t xml:space="preserve">22.4</w:t>
             </w:r>
           </w:p>
         </w:tc>
@@ -11320,7 +12792,7 @@
                 <w:sz w:val="24"/>
                 <w:szCs w:val="24"/>
               </w:rPr>
-              <w:t xml:space="preserve">17</w:t>
+              <w:t xml:space="preserve">20</w:t>
             </w:r>
           </w:p>
         </w:tc>
@@ -11346,7 +12818,7 @@
                 <w:sz w:val="24"/>
                 <w:szCs w:val="24"/>
               </w:rPr>
-              <w:t xml:space="preserve">13:15</w:t>
+              <w:t xml:space="preserve">16:15</w:t>
             </w:r>
           </w:p>
         </w:tc>
@@ -11372,7 +12844,7 @@
                 <w:sz w:val="24"/>
                 <w:szCs w:val="24"/>
               </w:rPr>
-              <w:t xml:space="preserve">13.3</w:t>
+              <w:t xml:space="preserve">16.3</w:t>
             </w:r>
           </w:p>
         </w:tc>
@@ -11426,7 +12898,7 @@
                 <w:sz w:val="24"/>
                 <w:szCs w:val="24"/>
               </w:rPr>
-              <w:t xml:space="preserve">36</w:t>
+              <w:t xml:space="preserve">44</w:t>
             </w:r>
           </w:p>
         </w:tc>
@@ -11452,7 +12924,7 @@
                 <w:sz w:val="24"/>
                 <w:szCs w:val="24"/>
               </w:rPr>
-              <w:t xml:space="preserve">31:23</w:t>
+              <w:t xml:space="preserve">38:38</w:t>
             </w:r>
           </w:p>
         </w:tc>
@@ -11478,7 +12950,7 @@
                 <w:sz w:val="24"/>
                 <w:szCs w:val="24"/>
               </w:rPr>
-              <w:t xml:space="preserve">31.4</w:t>
+              <w:t xml:space="preserve">38.6</w:t>
             </w:r>
           </w:p>
         </w:tc>

</xml_diff>

<commit_message>
Actualizar el registro de tiempos del Sprint 2 con el cierre completo
</commit_message>
<xml_diff>
--- a/Documentos/AEUVG - Desarrollo Sprint 2.docx
+++ b/Documentos/AEUVG - Desarrollo Sprint 2.docx
@@ -1899,7 +1899,7 @@
           <w:sz w:val="24"/>
           <w:szCs w:val="24"/>
         </w:rPr>
-        <w:t xml:space="preserve">Las seis historias comprometidas para el Sprint 2 se encuentran completadas, con 38.6 horas de trabajo de equipo frente a las 34 estimadas. El detalle por sesión se encuentra en la sección 10. La plataforma cuenta ahora con:</w:t>
+        <w:t xml:space="preserve">Las seis historias comprometidas para el Sprint 2 se encuentran completadas, con 43.3 horas de trabajo de equipo frente a las 34 estimadas. El detalle por sesión se encuentra en la sección 10. La plataforma cuenta ahora con:</w:t>
       </w:r>
     </w:p>
     <w:p>
@@ -2133,7 +2133,7 @@
           <w:sz w:val="24"/>
           <w:szCs w:val="24"/>
         </w:rPr>
-        <w:t xml:space="preserve">El sprint sumó 38.6 horas de equipo: 22.4 horas de Harry Méndez y 16.3 horas de Juan Gabriel Gualim, frente a las 34 horas estimadas en la planificación, es decir, un 14% por encima de lo previsto. La diferencia corresponde al día de cierre: la revisión con AEUVG dejó observaciones que se resolvieron el mismo 23 de septiembre, antes de publicar la versión del sprint.</w:t>
+        <w:t xml:space="preserve">El sprint sumó 43.3 horas de equipo: 24.7 horas de Harry Méndez y 18.6 horas de Juan Gabriel Gualim, frente a las 34 horas estimadas en la planificación, es decir, un 27% por encima de lo previsto. La diferencia corresponde al día de cierre: la revisión con AEUVG dejó observaciones que se resolvieron el mismo 23 de septiembre, antes de publicar la versión del sprint.</w:t>
       </w:r>
     </w:p>
     <w:p>
@@ -5918,7 +5918,7 @@
                 <w:sz w:val="24"/>
                 <w:szCs w:val="24"/>
               </w:rPr>
-              <w:t xml:space="preserve">11:20</w:t>
+              <w:t xml:space="preserve">11:15</w:t>
             </w:r>
           </w:p>
         </w:tc>
@@ -5944,7 +5944,7 @@
                 <w:sz w:val="24"/>
                 <w:szCs w:val="24"/>
               </w:rPr>
-              <w:t xml:space="preserve">12:40</w:t>
+              <w:t xml:space="preserve">12:45</w:t>
             </w:r>
           </w:p>
         </w:tc>
@@ -5970,7 +5970,7 @@
                 <w:sz w:val="24"/>
                 <w:szCs w:val="24"/>
               </w:rPr>
-              <w:t xml:space="preserve">0:10</w:t>
+              <w:t xml:space="preserve">0:15</w:t>
             </w:r>
           </w:p>
         </w:tc>
@@ -5996,7 +5996,7 @@
                 <w:sz w:val="24"/>
                 <w:szCs w:val="24"/>
               </w:rPr>
-              <w:t xml:space="preserve">1:10</w:t>
+              <w:t xml:space="preserve">1:15</w:t>
             </w:r>
           </w:p>
         </w:tc>
@@ -6048,7 +6048,7 @@
                 <w:sz w:val="24"/>
                 <w:szCs w:val="24"/>
               </w:rPr>
-              <w:t xml:space="preserve">AEUVG-81 Organizadores opcionales del evento. AEUVG-83 Mensaje explícito cuando la base no responde.</w:t>
+              <w:t xml:space="preserve">AEUVG-81 Organizadores opcionales del evento. AEUVG-83 Mensaje explícito cuando la base no responde. AEUVG-84 Mensajes de error del registro.</w:t>
             </w:r>
           </w:p>
         </w:tc>
@@ -6102,7 +6102,7 @@
                 <w:sz w:val="24"/>
                 <w:szCs w:val="24"/>
               </w:rPr>
-              <w:t xml:space="preserve">14:10</w:t>
+              <w:t xml:space="preserve">14:00</w:t>
             </w:r>
           </w:p>
         </w:tc>
@@ -6128,7 +6128,7 @@
                 <w:sz w:val="24"/>
                 <w:szCs w:val="24"/>
               </w:rPr>
-              <w:t xml:space="preserve">15:40</w:t>
+              <w:t xml:space="preserve">16:50</w:t>
             </w:r>
           </w:p>
         </w:tc>
@@ -6154,7 +6154,7 @@
                 <w:sz w:val="24"/>
                 <w:szCs w:val="24"/>
               </w:rPr>
-              <w:t xml:space="preserve">0:10</w:t>
+              <w:t xml:space="preserve">0:30</w:t>
             </w:r>
           </w:p>
         </w:tc>
@@ -6180,7 +6180,7 @@
                 <w:sz w:val="24"/>
                 <w:szCs w:val="24"/>
               </w:rPr>
-              <w:t xml:space="preserve">1:20</w:t>
+              <w:t xml:space="preserve">2:20</w:t>
             </w:r>
           </w:p>
         </w:tc>
@@ -6232,7 +6232,7 @@
                 <w:sz w:val="24"/>
                 <w:szCs w:val="24"/>
               </w:rPr>
-              <w:t xml:space="preserve">AEUVG-84 Mensajes de error del registro. AEUVG-87 Unificación de secciones del panel. AEUVG-88 Correcciones del listado y del detalle. AEUVG-90 Carga de la información institucional.</w:t>
+              <w:t xml:space="preserve">AEUVG-87 Unificación de secciones del panel. AEUVG-88 Correcciones del listado y del detalle. Corrección de la subida de imágenes en el contenedor. AEUVG-90 Carga de la información institucional de AEUVG.</w:t>
             </w:r>
           </w:p>
         </w:tc>
@@ -6286,7 +6286,7 @@
                 <w:sz w:val="24"/>
                 <w:szCs w:val="24"/>
               </w:rPr>
-              <w:t xml:space="preserve">19:40</w:t>
+              <w:t xml:space="preserve">18:05</w:t>
             </w:r>
           </w:p>
         </w:tc>
@@ -6312,7 +6312,7 @@
                 <w:sz w:val="24"/>
                 <w:szCs w:val="24"/>
               </w:rPr>
-              <w:t xml:space="preserve">20:45</w:t>
+              <w:t xml:space="preserve">20:50</w:t>
             </w:r>
           </w:p>
         </w:tc>
@@ -6338,7 +6338,7 @@
                 <w:sz w:val="24"/>
                 <w:szCs w:val="24"/>
               </w:rPr>
-              <w:t xml:space="preserve">0:10</w:t>
+              <w:t xml:space="preserve">0:25</w:t>
             </w:r>
           </w:p>
         </w:tc>
@@ -6364,7 +6364,7 @@
                 <w:sz w:val="24"/>
                 <w:szCs w:val="24"/>
               </w:rPr>
-              <w:t xml:space="preserve">0:55</w:t>
+              <w:t xml:space="preserve">2:20</w:t>
             </w:r>
           </w:p>
         </w:tc>
@@ -6470,7 +6470,7 @@
                 <w:sz w:val="24"/>
                 <w:szCs w:val="24"/>
               </w:rPr>
-              <w:t xml:space="preserve">21:30</w:t>
+              <w:t xml:space="preserve">22:15</w:t>
             </w:r>
           </w:p>
         </w:tc>
@@ -6496,7 +6496,7 @@
                 <w:sz w:val="24"/>
                 <w:szCs w:val="24"/>
               </w:rPr>
-              <w:t xml:space="preserve">21:45</w:t>
+              <w:t xml:space="preserve">23:05</w:t>
             </w:r>
           </w:p>
         </w:tc>
@@ -6522,7 +6522,7 @@
                 <w:sz w:val="24"/>
                 <w:szCs w:val="24"/>
               </w:rPr>
-              <w:t xml:space="preserve">0:00</w:t>
+              <w:t xml:space="preserve">0:10</w:t>
             </w:r>
           </w:p>
         </w:tc>
@@ -6548,7 +6548,7 @@
                 <w:sz w:val="24"/>
                 <w:szCs w:val="24"/>
               </w:rPr>
-              <w:t xml:space="preserve">0:15</w:t>
+              <w:t xml:space="preserve">0:40</w:t>
             </w:r>
           </w:p>
         </w:tc>
@@ -6575,190 +6575,6 @@
                 <w:szCs w:val="24"/>
               </w:rPr>
               <w:t xml:space="preserve">Integración</w:t>
-            </w:r>
-          </w:p>
-        </w:tc>
-        <w:tc>
-          <w:tcPr>
-            <w:tcW w:type="dxa" w:w="3800"/>
-            <w:tcMar>
-              <w:top w:type="dxa" w:w="80"/>
-              <w:left w:type="dxa" w:w="120"/>
-              <w:bottom w:type="dxa" w:w="80"/>
-              <w:right w:type="dxa" w:w="120"/>
-            </w:tcMar>
-          </w:tcPr>
-          <w:p>
-            <w:pPr>
-              <w:spacing w:after="0"/>
-            </w:pPr>
-            <w:r>
-              <w:rPr>
-                <w:rFonts w:ascii="Times New Roman" w:cs="Times New Roman" w:eastAsia="Times New Roman" w:hAnsi="Times New Roman"/>
-                <w:b w:val="false"/>
-                <w:bCs w:val="false"/>
-                <w:sz w:val="24"/>
-                <w:szCs w:val="24"/>
-              </w:rPr>
-              <w:t xml:space="preserve">Integración y publicación de los retratos de la Junta Directiva.</w:t>
-            </w:r>
-          </w:p>
-        </w:tc>
-      </w:tr>
-      <w:tr>
-        <w:tc>
-          <w:tcPr>
-            <w:tcW w:type="dxa" w:w="900"/>
-            <w:tcMar>
-              <w:top w:type="dxa" w:w="80"/>
-              <w:left w:type="dxa" w:w="120"/>
-              <w:bottom w:type="dxa" w:w="80"/>
-              <w:right w:type="dxa" w:w="120"/>
-            </w:tcMar>
-          </w:tcPr>
-          <w:p>
-            <w:pPr>
-              <w:spacing w:after="0"/>
-            </w:pPr>
-            <w:r>
-              <w:rPr>
-                <w:rFonts w:ascii="Times New Roman" w:cs="Times New Roman" w:eastAsia="Times New Roman" w:hAnsi="Times New Roman"/>
-                <w:b w:val="false"/>
-                <w:bCs w:val="false"/>
-                <w:sz w:val="24"/>
-                <w:szCs w:val="24"/>
-              </w:rPr>
-              <w:t xml:space="preserve">23/09/2026</w:t>
-            </w:r>
-          </w:p>
-        </w:tc>
-        <w:tc>
-          <w:tcPr>
-            <w:tcW w:type="dxa" w:w="680"/>
-            <w:tcMar>
-              <w:top w:type="dxa" w:w="80"/>
-              <w:left w:type="dxa" w:w="120"/>
-              <w:bottom w:type="dxa" w:w="80"/>
-              <w:right w:type="dxa" w:w="120"/>
-            </w:tcMar>
-          </w:tcPr>
-          <w:p>
-            <w:pPr>
-              <w:spacing w:after="0"/>
-            </w:pPr>
-            <w:r>
-              <w:rPr>
-                <w:rFonts w:ascii="Times New Roman" w:cs="Times New Roman" w:eastAsia="Times New Roman" w:hAnsi="Times New Roman"/>
-                <w:b w:val="false"/>
-                <w:bCs w:val="false"/>
-                <w:sz w:val="24"/>
-                <w:szCs w:val="24"/>
-              </w:rPr>
-              <w:t xml:space="preserve">22:45</w:t>
-            </w:r>
-          </w:p>
-        </w:tc>
-        <w:tc>
-          <w:tcPr>
-            <w:tcW w:type="dxa" w:w="680"/>
-            <w:tcMar>
-              <w:top w:type="dxa" w:w="80"/>
-              <w:left w:type="dxa" w:w="120"/>
-              <w:bottom w:type="dxa" w:w="80"/>
-              <w:right w:type="dxa" w:w="120"/>
-            </w:tcMar>
-          </w:tcPr>
-          <w:p>
-            <w:pPr>
-              <w:spacing w:after="0"/>
-            </w:pPr>
-            <w:r>
-              <w:rPr>
-                <w:rFonts w:ascii="Times New Roman" w:cs="Times New Roman" w:eastAsia="Times New Roman" w:hAnsi="Times New Roman"/>
-                <w:b w:val="false"/>
-                <w:bCs w:val="false"/>
-                <w:sz w:val="24"/>
-                <w:szCs w:val="24"/>
-              </w:rPr>
-              <w:t xml:space="preserve">23:20</w:t>
-            </w:r>
-          </w:p>
-        </w:tc>
-        <w:tc>
-          <w:tcPr>
-            <w:tcW w:type="dxa" w:w="1120"/>
-            <w:tcMar>
-              <w:top w:type="dxa" w:w="80"/>
-              <w:left w:type="dxa" w:w="120"/>
-              <w:bottom w:type="dxa" w:w="80"/>
-              <w:right w:type="dxa" w:w="120"/>
-            </w:tcMar>
-          </w:tcPr>
-          <w:p>
-            <w:pPr>
-              <w:spacing w:after="0"/>
-            </w:pPr>
-            <w:r>
-              <w:rPr>
-                <w:rFonts w:ascii="Times New Roman" w:cs="Times New Roman" w:eastAsia="Times New Roman" w:hAnsi="Times New Roman"/>
-                <w:b w:val="false"/>
-                <w:bCs w:val="false"/>
-                <w:sz w:val="24"/>
-                <w:szCs w:val="24"/>
-              </w:rPr>
-              <w:t xml:space="preserve">0:00</w:t>
-            </w:r>
-          </w:p>
-        </w:tc>
-        <w:tc>
-          <w:tcPr>
-            <w:tcW w:type="dxa" w:w="900"/>
-            <w:tcMar>
-              <w:top w:type="dxa" w:w="80"/>
-              <w:left w:type="dxa" w:w="120"/>
-              <w:bottom w:type="dxa" w:w="80"/>
-              <w:right w:type="dxa" w:w="120"/>
-            </w:tcMar>
-          </w:tcPr>
-          <w:p>
-            <w:pPr>
-              <w:spacing w:after="0"/>
-            </w:pPr>
-            <w:r>
-              <w:rPr>
-                <w:rFonts w:ascii="Times New Roman" w:cs="Times New Roman" w:eastAsia="Times New Roman" w:hAnsi="Times New Roman"/>
-                <w:b w:val="false"/>
-                <w:bCs w:val="false"/>
-                <w:sz w:val="24"/>
-                <w:szCs w:val="24"/>
-              </w:rPr>
-              <w:t xml:space="preserve">0:35</w:t>
-            </w:r>
-          </w:p>
-        </w:tc>
-        <w:tc>
-          <w:tcPr>
-            <w:tcW w:type="dxa" w:w="1280"/>
-            <w:tcMar>
-              <w:top w:type="dxa" w:w="80"/>
-              <w:left w:type="dxa" w:w="120"/>
-              <w:bottom w:type="dxa" w:w="80"/>
-              <w:right w:type="dxa" w:w="120"/>
-            </w:tcMar>
-          </w:tcPr>
-          <w:p>
-            <w:pPr>
-              <w:spacing w:after="0"/>
-            </w:pPr>
-            <w:r>
-              <w:rPr>
-                <w:rFonts w:ascii="Times New Roman" w:cs="Times New Roman" w:eastAsia="Times New Roman" w:hAnsi="Times New Roman"/>
-                <w:b w:val="false"/>
-                <w:bCs w:val="false"/>
-                <w:sz w:val="24"/>
-                <w:szCs w:val="24"/>
-              </w:rPr>
-              <w:t xml:space="preserve">Documentación</w:t>
             </w:r>
           </w:p>
         </w:tc>
@@ -7526,7 +7342,7 @@
                 <w:sz w:val="24"/>
                 <w:szCs w:val="24"/>
               </w:rPr>
-              <w:t xml:space="preserve">4:35</w:t>
+              <w:t xml:space="preserve">6:50</w:t>
             </w:r>
           </w:p>
         </w:tc>
@@ -7552,7 +7368,7 @@
                 <w:sz w:val="24"/>
                 <w:szCs w:val="24"/>
               </w:rPr>
-              <w:t xml:space="preserve">4.5</w:t>
+              <w:t xml:space="preserve">6.8</w:t>
             </w:r>
           </w:p>
         </w:tc>
@@ -7606,7 +7422,7 @@
                 <w:sz w:val="24"/>
                 <w:szCs w:val="24"/>
               </w:rPr>
-              <w:t xml:space="preserve">3:45</w:t>
+              <w:t xml:space="preserve">3:50</w:t>
             </w:r>
           </w:p>
         </w:tc>
@@ -7686,7 +7502,7 @@
                 <w:sz w:val="24"/>
                 <w:szCs w:val="24"/>
               </w:rPr>
-              <w:t xml:space="preserve">22:23</w:t>
+              <w:t xml:space="preserve">24:43</w:t>
             </w:r>
           </w:p>
         </w:tc>
@@ -7712,7 +7528,7 @@
                 <w:sz w:val="24"/>
                 <w:szCs w:val="24"/>
               </w:rPr>
-              <w:t xml:space="preserve">22.4</w:t>
+              <w:t xml:space="preserve">24.7</w:t>
             </w:r>
           </w:p>
         </w:tc>
@@ -11132,7 +10948,7 @@
                 <w:sz w:val="24"/>
                 <w:szCs w:val="24"/>
               </w:rPr>
-              <w:t xml:space="preserve">11:30</w:t>
+              <w:t xml:space="preserve">11:25</w:t>
             </w:r>
           </w:p>
         </w:tc>
@@ -11210,7 +11026,7 @@
                 <w:sz w:val="24"/>
                 <w:szCs w:val="24"/>
               </w:rPr>
-              <w:t xml:space="preserve">1:00</w:t>
+              <w:t xml:space="preserve">1:05</w:t>
             </w:r>
           </w:p>
         </w:tc>
@@ -11316,7 +11132,7 @@
                 <w:sz w:val="24"/>
                 <w:szCs w:val="24"/>
               </w:rPr>
-              <w:t xml:space="preserve">15:05</w:t>
+              <w:t xml:space="preserve">15:20</w:t>
             </w:r>
           </w:p>
         </w:tc>
@@ -11342,7 +11158,7 @@
                 <w:sz w:val="24"/>
                 <w:szCs w:val="24"/>
               </w:rPr>
-              <w:t xml:space="preserve">15:45</w:t>
+              <w:t xml:space="preserve">18:00</w:t>
             </w:r>
           </w:p>
         </w:tc>
@@ -11368,7 +11184,7 @@
                 <w:sz w:val="24"/>
                 <w:szCs w:val="24"/>
               </w:rPr>
-              <w:t xml:space="preserve">0:05</w:t>
+              <w:t xml:space="preserve">0:20</w:t>
             </w:r>
           </w:p>
         </w:tc>
@@ -11394,7 +11210,7 @@
                 <w:sz w:val="24"/>
                 <w:szCs w:val="24"/>
               </w:rPr>
-              <w:t xml:space="preserve">0:35</w:t>
+              <w:t xml:space="preserve">2:20</w:t>
             </w:r>
           </w:p>
         </w:tc>
@@ -11500,7 +11316,7 @@
                 <w:sz w:val="24"/>
                 <w:szCs w:val="24"/>
               </w:rPr>
-              <w:t xml:space="preserve">21:10</w:t>
+              <w:t xml:space="preserve">20:00</w:t>
             </w:r>
           </w:p>
         </w:tc>
@@ -11526,12 +11342,196 @@
                 <w:sz w:val="24"/>
                 <w:szCs w:val="24"/>
               </w:rPr>
+              <w:t xml:space="preserve">21:50</w:t>
+            </w:r>
+          </w:p>
+        </w:tc>
+        <w:tc>
+          <w:tcPr>
+            <w:tcW w:type="dxa" w:w="1120"/>
+            <w:tcMar>
+              <w:top w:type="dxa" w:w="80"/>
+              <w:left w:type="dxa" w:w="120"/>
+              <w:bottom w:type="dxa" w:w="80"/>
+              <w:right w:type="dxa" w:w="120"/>
+            </w:tcMar>
+          </w:tcPr>
+          <w:p>
+            <w:pPr>
+              <w:spacing w:after="0"/>
+            </w:pPr>
+            <w:r>
+              <w:rPr>
+                <w:rFonts w:ascii="Times New Roman" w:cs="Times New Roman" w:eastAsia="Times New Roman" w:hAnsi="Times New Roman"/>
+                <w:b w:val="false"/>
+                <w:bCs w:val="false"/>
+                <w:sz w:val="24"/>
+                <w:szCs w:val="24"/>
+              </w:rPr>
+              <w:t xml:space="preserve">0:15</w:t>
+            </w:r>
+          </w:p>
+        </w:tc>
+        <w:tc>
+          <w:tcPr>
+            <w:tcW w:type="dxa" w:w="900"/>
+            <w:tcMar>
+              <w:top w:type="dxa" w:w="80"/>
+              <w:left w:type="dxa" w:w="120"/>
+              <w:bottom w:type="dxa" w:w="80"/>
+              <w:right w:type="dxa" w:w="120"/>
+            </w:tcMar>
+          </w:tcPr>
+          <w:p>
+            <w:pPr>
+              <w:spacing w:after="0"/>
+            </w:pPr>
+            <w:r>
+              <w:rPr>
+                <w:rFonts w:ascii="Times New Roman" w:cs="Times New Roman" w:eastAsia="Times New Roman" w:hAnsi="Times New Roman"/>
+                <w:b w:val="false"/>
+                <w:bCs w:val="false"/>
+                <w:sz w:val="24"/>
+                <w:szCs w:val="24"/>
+              </w:rPr>
+              <w:t xml:space="preserve">1:35</w:t>
+            </w:r>
+          </w:p>
+        </w:tc>
+        <w:tc>
+          <w:tcPr>
+            <w:tcW w:type="dxa" w:w="1280"/>
+            <w:tcMar>
+              <w:top w:type="dxa" w:w="80"/>
+              <w:left w:type="dxa" w:w="120"/>
+              <w:bottom w:type="dxa" w:w="80"/>
+              <w:right w:type="dxa" w:w="120"/>
+            </w:tcMar>
+          </w:tcPr>
+          <w:p>
+            <w:pPr>
+              <w:spacing w:after="0"/>
+            </w:pPr>
+            <w:r>
+              <w:rPr>
+                <w:rFonts w:ascii="Times New Roman" w:cs="Times New Roman" w:eastAsia="Times New Roman" w:hAnsi="Times New Roman"/>
+                <w:b w:val="false"/>
+                <w:bCs w:val="false"/>
+                <w:sz w:val="24"/>
+                <w:szCs w:val="24"/>
+              </w:rPr>
+              <w:t xml:space="preserve">Diseño y codificación</w:t>
+            </w:r>
+          </w:p>
+        </w:tc>
+        <w:tc>
+          <w:tcPr>
+            <w:tcW w:type="dxa" w:w="3800"/>
+            <w:tcMar>
+              <w:top w:type="dxa" w:w="80"/>
+              <w:left w:type="dxa" w:w="120"/>
+              <w:bottom w:type="dxa" w:w="80"/>
+              <w:right w:type="dxa" w:w="120"/>
+            </w:tcMar>
+          </w:tcPr>
+          <w:p>
+            <w:pPr>
+              <w:spacing w:after="0"/>
+            </w:pPr>
+            <w:r>
+              <w:rPr>
+                <w:rFonts w:ascii="Times New Roman" w:cs="Times New Roman" w:eastAsia="Times New Roman" w:hAnsi="Times New Roman"/>
+                <w:b w:val="false"/>
+                <w:bCs w:val="false"/>
+                <w:sz w:val="24"/>
+                <w:szCs w:val="24"/>
+              </w:rPr>
+              <w:t xml:space="preserve">AEUVG-95 Retratos sin fondo de estudio. AEUVG-96 Menú de la cuenta. AEUVG-97 Detalle del evento a dos columnas. AEUVG-98 Filtros plegables.</w:t>
+            </w:r>
+          </w:p>
+        </w:tc>
+      </w:tr>
+      <w:tr>
+        <w:tc>
+          <w:tcPr>
+            <w:tcW w:type="dxa" w:w="900"/>
+            <w:tcMar>
+              <w:top w:type="dxa" w:w="80"/>
+              <w:left w:type="dxa" w:w="120"/>
+              <w:bottom w:type="dxa" w:w="80"/>
+              <w:right w:type="dxa" w:w="120"/>
+            </w:tcMar>
+          </w:tcPr>
+          <w:p>
+            <w:pPr>
+              <w:spacing w:after="0"/>
+            </w:pPr>
+            <w:r>
+              <w:rPr>
+                <w:rFonts w:ascii="Times New Roman" w:cs="Times New Roman" w:eastAsia="Times New Roman" w:hAnsi="Times New Roman"/>
+                <w:b w:val="false"/>
+                <w:bCs w:val="false"/>
+                <w:sz w:val="24"/>
+                <w:szCs w:val="24"/>
+              </w:rPr>
+              <w:t xml:space="preserve">23/09/2026</w:t>
+            </w:r>
+          </w:p>
+        </w:tc>
+        <w:tc>
+          <w:tcPr>
+            <w:tcW w:type="dxa" w:w="680"/>
+            <w:tcMar>
+              <w:top w:type="dxa" w:w="80"/>
+              <w:left w:type="dxa" w:w="120"/>
+              <w:bottom w:type="dxa" w:w="80"/>
+              <w:right w:type="dxa" w:w="120"/>
+            </w:tcMar>
+          </w:tcPr>
+          <w:p>
+            <w:pPr>
+              <w:spacing w:after="0"/>
+            </w:pPr>
+            <w:r>
+              <w:rPr>
+                <w:rFonts w:ascii="Times New Roman" w:cs="Times New Roman" w:eastAsia="Times New Roman" w:hAnsi="Times New Roman"/>
+                <w:b w:val="false"/>
+                <w:bCs w:val="false"/>
+                <w:sz w:val="24"/>
+                <w:szCs w:val="24"/>
+              </w:rPr>
               <w:t xml:space="preserve">22:40</w:t>
             </w:r>
           </w:p>
         </w:tc>
         <w:tc>
           <w:tcPr>
+            <w:tcW w:type="dxa" w:w="680"/>
+            <w:tcMar>
+              <w:top w:type="dxa" w:w="80"/>
+              <w:left w:type="dxa" w:w="120"/>
+              <w:bottom w:type="dxa" w:w="80"/>
+              <w:right w:type="dxa" w:w="120"/>
+            </w:tcMar>
+          </w:tcPr>
+          <w:p>
+            <w:pPr>
+              <w:spacing w:after="0"/>
+            </w:pPr>
+            <w:r>
+              <w:rPr>
+                <w:rFonts w:ascii="Times New Roman" w:cs="Times New Roman" w:eastAsia="Times New Roman" w:hAnsi="Times New Roman"/>
+                <w:b w:val="false"/>
+                <w:bCs w:val="false"/>
+                <w:sz w:val="24"/>
+                <w:szCs w:val="24"/>
+              </w:rPr>
+              <w:t xml:space="preserve">23:00</w:t>
+            </w:r>
+          </w:p>
+        </w:tc>
+        <w:tc>
+          <w:tcPr>
             <w:tcW w:type="dxa" w:w="1120"/>
             <w:tcMar>
               <w:top w:type="dxa" w:w="80"/>
@@ -11552,7 +11552,7 @@
                 <w:sz w:val="24"/>
                 <w:szCs w:val="24"/>
               </w:rPr>
-              <w:t xml:space="preserve">0:05</w:t>
+              <w:t xml:space="preserve">0:00</w:t>
             </w:r>
           </w:p>
         </w:tc>
@@ -11578,7 +11578,7 @@
                 <w:sz w:val="24"/>
                 <w:szCs w:val="24"/>
               </w:rPr>
-              <w:t xml:space="preserve">1:25</w:t>
+              <w:t xml:space="preserve">0:20</w:t>
             </w:r>
           </w:p>
         </w:tc>
@@ -11604,7 +11604,7 @@
                 <w:sz w:val="24"/>
                 <w:szCs w:val="24"/>
               </w:rPr>
-              <w:t xml:space="preserve">Diseño y codificación</w:t>
+              <w:t xml:space="preserve">Integración</w:t>
             </w:r>
           </w:p>
         </w:tc>
@@ -11630,7 +11630,7 @@
                 <w:sz w:val="24"/>
                 <w:szCs w:val="24"/>
               </w:rPr>
-              <w:t xml:space="preserve">AEUVG-95 Retratos sin fondo de estudio. AEUVG-96 Menú de la cuenta. AEUVG-97 Detalle del evento a dos columnas. AEUVG-98 Filtros plegables.</w:t>
+              <w:t xml:space="preserve">Arranque del contenedor en Railway para habilitar la subida de imágenes y conservación de la ruta de la imagen al guardar el evento.</w:t>
             </w:r>
           </w:p>
         </w:tc>
@@ -12372,7 +12372,7 @@
                 <w:sz w:val="24"/>
                 <w:szCs w:val="24"/>
               </w:rPr>
-              <w:t xml:space="preserve">4:35</w:t>
+              <w:t xml:space="preserve">6:55</w:t>
             </w:r>
           </w:p>
         </w:tc>
@@ -12398,7 +12398,7 @@
                 <w:sz w:val="24"/>
                 <w:szCs w:val="24"/>
               </w:rPr>
-              <w:t xml:space="preserve">4.6</w:t>
+              <w:t xml:space="preserve">6.9</w:t>
             </w:r>
           </w:p>
         </w:tc>
@@ -12452,7 +12452,7 @@
                 <w:sz w:val="24"/>
                 <w:szCs w:val="24"/>
               </w:rPr>
-              <w:t xml:space="preserve">16:15</w:t>
+              <w:t xml:space="preserve">18:35</w:t>
             </w:r>
           </w:p>
         </w:tc>
@@ -12478,7 +12478,7 @@
                 <w:sz w:val="24"/>
                 <w:szCs w:val="24"/>
               </w:rPr>
-              <w:t xml:space="preserve">16.3</w:t>
+              <w:t xml:space="preserve">18.6</w:t>
             </w:r>
           </w:p>
         </w:tc>
@@ -12686,7 +12686,7 @@
                 <w:sz w:val="24"/>
                 <w:szCs w:val="24"/>
               </w:rPr>
-              <w:t xml:space="preserve">24</w:t>
+              <w:t xml:space="preserve">23</w:t>
             </w:r>
           </w:p>
         </w:tc>
@@ -12712,7 +12712,7 @@
                 <w:sz w:val="24"/>
                 <w:szCs w:val="24"/>
               </w:rPr>
-              <w:t xml:space="preserve">22:23</w:t>
+              <w:t xml:space="preserve">24:43</w:t>
             </w:r>
           </w:p>
         </w:tc>
@@ -12738,7 +12738,7 @@
                 <w:sz w:val="24"/>
                 <w:szCs w:val="24"/>
               </w:rPr>
-              <w:t xml:space="preserve">22.4</w:t>
+              <w:t xml:space="preserve">24.7</w:t>
             </w:r>
           </w:p>
         </w:tc>
@@ -12792,7 +12792,7 @@
                 <w:sz w:val="24"/>
                 <w:szCs w:val="24"/>
               </w:rPr>
-              <w:t xml:space="preserve">20</w:t>
+              <w:t xml:space="preserve">21</w:t>
             </w:r>
           </w:p>
         </w:tc>
@@ -12818,7 +12818,7 @@
                 <w:sz w:val="24"/>
                 <w:szCs w:val="24"/>
               </w:rPr>
-              <w:t xml:space="preserve">16:15</w:t>
+              <w:t xml:space="preserve">18:35</w:t>
             </w:r>
           </w:p>
         </w:tc>
@@ -12844,7 +12844,7 @@
                 <w:sz w:val="24"/>
                 <w:szCs w:val="24"/>
               </w:rPr>
-              <w:t xml:space="preserve">16.3</w:t>
+              <w:t xml:space="preserve">18.6</w:t>
             </w:r>
           </w:p>
         </w:tc>
@@ -12924,7 +12924,7 @@
                 <w:sz w:val="24"/>
                 <w:szCs w:val="24"/>
               </w:rPr>
-              <w:t xml:space="preserve">38:38</w:t>
+              <w:t xml:space="preserve">43:18</w:t>
             </w:r>
           </w:p>
         </w:tc>
@@ -12950,7 +12950,7 @@
                 <w:sz w:val="24"/>
                 <w:szCs w:val="24"/>
               </w:rPr>
-              <w:t xml:space="preserve">38.6</w:t>
+              <w:t xml:space="preserve">43.3</w:t>
             </w:r>
           </w:p>
         </w:tc>

</xml_diff>